<commit_message>
update design and add details in docx
</commit_message>
<xml_diff>
--- a/Report_GGNIN.docx
+++ b/Report_GGNIN.docx
@@ -51,11 +51,7 @@
             <w:bookmarkStart w:id="1" w:name="TitleCell" w:colFirst="0" w:colLast="0"/>
             <w:bookmarkEnd w:id="0"/>
             <w:r>
-              <w:t xml:space="preserve">Work </w:t>
-            </w:r>
-            <w:proofErr w:type="gramStart"/>
-            <w:r>
-              <w:t>Order</w:t>
+              <w:t>Work Order</w:t>
             </w:r>
             <w:r>
               <w:t>:</w:t>
@@ -64,16 +60,7 @@
               <w:t xml:space="preserve"> </w:t>
             </w:r>
             <w:r>
-              <w:t>{</w:t>
-            </w:r>
-            <w:proofErr w:type="spellStart"/>
-            <w:proofErr w:type="gramEnd"/>
-            <w:r>
-              <w:t>workOrder</w:t>
-            </w:r>
-            <w:proofErr w:type="spellEnd"/>
-            <w:r>
-              <w:t>}</w:t>
+              <w:t>{workOrder}</w:t>
             </w:r>
           </w:p>
           <w:p>
@@ -1590,7 +1577,6 @@
               </w:rPr>
               <w:t>{</w:t>
             </w:r>
-            <w:proofErr w:type="spellStart"/>
             <w:r>
               <w:rPr>
                 <w:rFonts w:ascii="Verdana" w:hAnsi="Verdana" w:cs="Calibri"/>
@@ -1600,19 +1586,7 @@
                 <w:sz w:val="22"/>
                 <w:szCs w:val="22"/>
               </w:rPr>
-              <w:t>workOrder</w:t>
-            </w:r>
-            <w:proofErr w:type="spellEnd"/>
-            <w:r>
-              <w:rPr>
-                <w:rFonts w:ascii="Verdana" w:hAnsi="Verdana" w:cs="Calibri"/>
-                <w:b/>
-                <w:bCs/>
-                <w:color w:val="FFFFFF"/>
-                <w:sz w:val="22"/>
-                <w:szCs w:val="22"/>
-              </w:rPr>
-              <w:t>}</w:t>
+              <w:t>workOrder}</w:t>
             </w:r>
           </w:p>
         </w:tc>
@@ -1689,6 +1663,60 @@
               </w:rPr>
               <w:t> </w:t>
             </w:r>
+            <w:r>
+              <w:rPr>
+                <w:rFonts w:ascii="Verdana" w:hAnsi="Verdana" w:cs="Calibri"/>
+                <w:color w:val="000000"/>
+                <w:sz w:val="22"/>
+                <w:szCs w:val="22"/>
+              </w:rPr>
+              <w:t>{#</w:t>
+            </w:r>
+            <w:r>
+              <w:rPr>
+                <w:rFonts w:ascii="Verdana" w:hAnsi="Verdana" w:cs="Calibri"/>
+                <w:color w:val="000000"/>
+                <w:sz w:val="22"/>
+                <w:szCs w:val="22"/>
+              </w:rPr>
+              <w:t>Details</w:t>
+            </w:r>
+            <w:r>
+              <w:rPr>
+                <w:rFonts w:ascii="Verdana" w:hAnsi="Verdana" w:cs="Calibri"/>
+                <w:color w:val="000000"/>
+                <w:sz w:val="22"/>
+                <w:szCs w:val="22"/>
+              </w:rPr>
+              <w:t>}</w:t>
+            </w:r>
+            <w:r>
+              <w:rPr>
+                <w:rFonts w:ascii="Verdana" w:hAnsi="Verdana" w:cs="Calibri"/>
+                <w:color w:val="000000"/>
+                <w:sz w:val="22"/>
+                <w:szCs w:val="22"/>
+              </w:rPr>
+              <w:t>{</w:t>
+            </w:r>
+            <w:r>
+              <w:rPr>
+                <w:rFonts w:ascii="Verdana" w:hAnsi="Verdana" w:cs="Calibri"/>
+                <w:color w:val="000000"/>
+                <w:sz w:val="22"/>
+                <w:szCs w:val="22"/>
+              </w:rPr>
+              <w:t>requestedBy</w:t>
+            </w:r>
+            <w:r>
+              <w:rPr>
+                <w:rFonts w:ascii="Verdana" w:hAnsi="Verdana" w:cs="Calibri"/>
+                <w:color w:val="000000"/>
+                <w:sz w:val="22"/>
+                <w:szCs w:val="22"/>
+              </w:rPr>
+              <w:t>}</w:t>
+            </w:r>
           </w:p>
         </w:tc>
       </w:tr>
@@ -1764,6 +1792,33 @@
               </w:rPr>
               <w:t> </w:t>
             </w:r>
+            <w:r>
+              <w:rPr>
+                <w:rFonts w:ascii="Verdana" w:hAnsi="Verdana" w:cs="Calibri"/>
+                <w:color w:val="000000"/>
+                <w:sz w:val="22"/>
+                <w:szCs w:val="22"/>
+              </w:rPr>
+              <w:t>{</w:t>
+            </w:r>
+            <w:r>
+              <w:rPr>
+                <w:rFonts w:ascii="Verdana" w:hAnsi="Verdana" w:cs="Calibri"/>
+                <w:color w:val="000000"/>
+                <w:sz w:val="22"/>
+                <w:szCs w:val="22"/>
+              </w:rPr>
+              <w:t>receivedDate</w:t>
+            </w:r>
+            <w:r>
+              <w:rPr>
+                <w:rFonts w:ascii="Verdana" w:hAnsi="Verdana" w:cs="Calibri"/>
+                <w:color w:val="000000"/>
+                <w:sz w:val="22"/>
+                <w:szCs w:val="22"/>
+              </w:rPr>
+              <w:t>}</w:t>
+            </w:r>
           </w:p>
         </w:tc>
       </w:tr>
@@ -1839,6 +1894,15 @@
               </w:rPr>
               <w:t> </w:t>
             </w:r>
+            <w:r>
+              <w:rPr>
+                <w:rFonts w:ascii="Verdana" w:hAnsi="Verdana" w:cs="Calibri"/>
+                <w:color w:val="000000"/>
+                <w:sz w:val="22"/>
+                <w:szCs w:val="22"/>
+              </w:rPr>
+              <w:t>{circle}</w:t>
+            </w:r>
           </w:p>
         </w:tc>
       </w:tr>
@@ -1914,6 +1978,33 @@
               </w:rPr>
               <w:t> </w:t>
             </w:r>
+            <w:r>
+              <w:rPr>
+                <w:rFonts w:ascii="Verdana" w:hAnsi="Verdana" w:cs="Calibri"/>
+                <w:color w:val="000000"/>
+                <w:sz w:val="22"/>
+                <w:szCs w:val="22"/>
+              </w:rPr>
+              <w:t>{</w:t>
+            </w:r>
+            <w:r>
+              <w:rPr>
+                <w:rFonts w:ascii="Verdana" w:hAnsi="Verdana" w:cs="Calibri"/>
+                <w:color w:val="000000"/>
+                <w:sz w:val="22"/>
+                <w:szCs w:val="22"/>
+              </w:rPr>
+              <w:t>cardProfile</w:t>
+            </w:r>
+            <w:r>
+              <w:rPr>
+                <w:rFonts w:ascii="Verdana" w:hAnsi="Verdana" w:cs="Calibri"/>
+                <w:color w:val="000000"/>
+                <w:sz w:val="22"/>
+                <w:szCs w:val="22"/>
+              </w:rPr>
+              <w:t>}</w:t>
+            </w:r>
           </w:p>
         </w:tc>
       </w:tr>
@@ -1989,6 +2080,33 @@
               </w:rPr>
               <w:t> </w:t>
             </w:r>
+            <w:r>
+              <w:rPr>
+                <w:rFonts w:ascii="Verdana" w:hAnsi="Verdana" w:cs="Calibri"/>
+                <w:color w:val="000000"/>
+                <w:sz w:val="22"/>
+                <w:szCs w:val="22"/>
+              </w:rPr>
+              <w:t>{</w:t>
+            </w:r>
+            <w:r>
+              <w:rPr>
+                <w:rFonts w:ascii="Verdana" w:hAnsi="Verdana" w:cs="Calibri"/>
+                <w:color w:val="000000"/>
+                <w:sz w:val="22"/>
+                <w:szCs w:val="22"/>
+              </w:rPr>
+              <w:t>vendor</w:t>
+            </w:r>
+            <w:r>
+              <w:rPr>
+                <w:rFonts w:ascii="Verdana" w:hAnsi="Verdana" w:cs="Calibri"/>
+                <w:color w:val="000000"/>
+                <w:sz w:val="22"/>
+                <w:szCs w:val="22"/>
+              </w:rPr>
+              <w:t>}</w:t>
+            </w:r>
           </w:p>
         </w:tc>
       </w:tr>
@@ -2064,6 +2182,33 @@
               </w:rPr>
               <w:t> </w:t>
             </w:r>
+            <w:r>
+              <w:rPr>
+                <w:rFonts w:ascii="Verdana" w:hAnsi="Verdana" w:cs="Calibri"/>
+                <w:color w:val="000000"/>
+                <w:sz w:val="22"/>
+                <w:szCs w:val="22"/>
+              </w:rPr>
+              <w:t>{</w:t>
+            </w:r>
+            <w:r>
+              <w:rPr>
+                <w:rFonts w:ascii="Verdana" w:hAnsi="Verdana" w:cs="Calibri"/>
+                <w:color w:val="000000"/>
+                <w:sz w:val="22"/>
+                <w:szCs w:val="22"/>
+              </w:rPr>
+              <w:t>lotSize</w:t>
+            </w:r>
+            <w:r>
+              <w:rPr>
+                <w:rFonts w:ascii="Verdana" w:hAnsi="Verdana" w:cs="Calibri"/>
+                <w:color w:val="000000"/>
+                <w:sz w:val="22"/>
+                <w:szCs w:val="22"/>
+              </w:rPr>
+              <w:t>}</w:t>
+            </w:r>
           </w:p>
         </w:tc>
       </w:tr>
@@ -2139,6 +2284,33 @@
               </w:rPr>
               <w:t> </w:t>
             </w:r>
+            <w:r>
+              <w:rPr>
+                <w:rFonts w:ascii="Verdana" w:hAnsi="Verdana" w:cs="Calibri"/>
+                <w:color w:val="000000"/>
+                <w:sz w:val="22"/>
+                <w:szCs w:val="22"/>
+              </w:rPr>
+              <w:t>{</w:t>
+            </w:r>
+            <w:r>
+              <w:rPr>
+                <w:rFonts w:ascii="Verdana" w:hAnsi="Verdana" w:cs="Calibri"/>
+                <w:color w:val="000000"/>
+                <w:sz w:val="22"/>
+                <w:szCs w:val="22"/>
+              </w:rPr>
+              <w:t>poNo</w:t>
+            </w:r>
+            <w:r>
+              <w:rPr>
+                <w:rFonts w:ascii="Verdana" w:hAnsi="Verdana" w:cs="Calibri"/>
+                <w:color w:val="000000"/>
+                <w:sz w:val="22"/>
+                <w:szCs w:val="22"/>
+              </w:rPr>
+              <w:t>}</w:t>
+            </w:r>
           </w:p>
         </w:tc>
       </w:tr>
@@ -2214,6 +2386,33 @@
               </w:rPr>
               <w:t> </w:t>
             </w:r>
+            <w:r>
+              <w:rPr>
+                <w:rFonts w:ascii="Verdana" w:hAnsi="Verdana" w:cs="Calibri"/>
+                <w:color w:val="000000"/>
+                <w:sz w:val="22"/>
+                <w:szCs w:val="22"/>
+              </w:rPr>
+              <w:t>{</w:t>
+            </w:r>
+            <w:r>
+              <w:rPr>
+                <w:rFonts w:ascii="Verdana" w:hAnsi="Verdana" w:cs="Calibri"/>
+                <w:color w:val="000000"/>
+                <w:sz w:val="22"/>
+                <w:szCs w:val="22"/>
+              </w:rPr>
+              <w:t>invoiceNo</w:t>
+            </w:r>
+            <w:r>
+              <w:rPr>
+                <w:rFonts w:ascii="Verdana" w:hAnsi="Verdana" w:cs="Calibri"/>
+                <w:color w:val="000000"/>
+                <w:sz w:val="22"/>
+                <w:szCs w:val="22"/>
+              </w:rPr>
+              <w:t>}</w:t>
+            </w:r>
           </w:p>
         </w:tc>
       </w:tr>
@@ -2289,6 +2488,33 @@
               </w:rPr>
               <w:t> </w:t>
             </w:r>
+            <w:r>
+              <w:rPr>
+                <w:rFonts w:ascii="Verdana" w:hAnsi="Verdana" w:cs="Calibri"/>
+                <w:color w:val="000000"/>
+                <w:sz w:val="22"/>
+                <w:szCs w:val="22"/>
+              </w:rPr>
+              <w:t>{</w:t>
+            </w:r>
+            <w:r>
+              <w:rPr>
+                <w:rFonts w:ascii="Verdana" w:hAnsi="Verdana" w:cs="Calibri"/>
+                <w:color w:val="000000"/>
+                <w:sz w:val="22"/>
+                <w:szCs w:val="22"/>
+              </w:rPr>
+              <w:t>startingICCID</w:t>
+            </w:r>
+            <w:r>
+              <w:rPr>
+                <w:rFonts w:ascii="Verdana" w:hAnsi="Verdana" w:cs="Calibri"/>
+                <w:color w:val="000000"/>
+                <w:sz w:val="22"/>
+                <w:szCs w:val="22"/>
+              </w:rPr>
+              <w:t>}</w:t>
+            </w:r>
           </w:p>
         </w:tc>
       </w:tr>
@@ -2364,6 +2590,33 @@
               </w:rPr>
               <w:t> </w:t>
             </w:r>
+            <w:r>
+              <w:rPr>
+                <w:rFonts w:ascii="Verdana" w:hAnsi="Verdana" w:cs="Calibri"/>
+                <w:color w:val="000000"/>
+                <w:sz w:val="22"/>
+                <w:szCs w:val="22"/>
+              </w:rPr>
+              <w:t>{</w:t>
+            </w:r>
+            <w:r>
+              <w:rPr>
+                <w:rFonts w:ascii="Verdana" w:hAnsi="Verdana" w:cs="Calibri"/>
+                <w:color w:val="000000"/>
+                <w:sz w:val="22"/>
+                <w:szCs w:val="22"/>
+              </w:rPr>
+              <w:t>endingICCID</w:t>
+            </w:r>
+            <w:r>
+              <w:rPr>
+                <w:rFonts w:ascii="Verdana" w:hAnsi="Verdana" w:cs="Calibri"/>
+                <w:color w:val="000000"/>
+                <w:sz w:val="22"/>
+                <w:szCs w:val="22"/>
+              </w:rPr>
+              <w:t>}</w:t>
+            </w:r>
           </w:p>
         </w:tc>
       </w:tr>
@@ -2439,6 +2692,60 @@
               </w:rPr>
               <w:t> </w:t>
             </w:r>
+            <w:r>
+              <w:rPr>
+                <w:rFonts w:ascii="Verdana" w:hAnsi="Verdana" w:cs="Calibri"/>
+                <w:color w:val="000000"/>
+                <w:sz w:val="22"/>
+                <w:szCs w:val="22"/>
+              </w:rPr>
+              <w:t>{</w:t>
+            </w:r>
+            <w:r>
+              <w:rPr>
+                <w:rFonts w:ascii="Verdana" w:hAnsi="Verdana" w:cs="Calibri"/>
+                <w:color w:val="000000"/>
+                <w:sz w:val="22"/>
+                <w:szCs w:val="22"/>
+              </w:rPr>
+              <w:t>testingCompleted</w:t>
+            </w:r>
+            <w:r>
+              <w:rPr>
+                <w:rFonts w:ascii="Verdana" w:hAnsi="Verdana" w:cs="Calibri"/>
+                <w:color w:val="000000"/>
+                <w:sz w:val="22"/>
+                <w:szCs w:val="22"/>
+              </w:rPr>
+              <w:t>}</w:t>
+            </w:r>
+            <w:r>
+              <w:rPr>
+                <w:rFonts w:ascii="Verdana" w:hAnsi="Verdana" w:cs="Calibri"/>
+                <w:color w:val="000000"/>
+                <w:sz w:val="22"/>
+                <w:szCs w:val="22"/>
+              </w:rPr>
+              <w:t>{/</w:t>
+            </w:r>
+            <w:r>
+              <w:rPr>
+                <w:rFonts w:ascii="Verdana" w:hAnsi="Verdana" w:cs="Calibri"/>
+                <w:color w:val="000000"/>
+                <w:sz w:val="22"/>
+                <w:szCs w:val="22"/>
+              </w:rPr>
+              <w:t>Details</w:t>
+            </w:r>
+            <w:r>
+              <w:rPr>
+                <w:rFonts w:ascii="Verdana" w:hAnsi="Verdana" w:cs="Calibri"/>
+                <w:color w:val="000000"/>
+                <w:sz w:val="22"/>
+                <w:szCs w:val="22"/>
+              </w:rPr>
+              <w:t>}</w:t>
+            </w:r>
           </w:p>
         </w:tc>
       </w:tr>
@@ -2720,25 +3027,23 @@
           <w:sz w:val="22"/>
           <w:szCs w:val="22"/>
         </w:rPr>
-        <w:t xml:space="preserve">above </w:t>
-      </w:r>
-      <w:proofErr w:type="spellStart"/>
+        <w:t xml:space="preserve">above metioned </w:t>
+      </w:r>
       <w:r>
         <w:rPr>
           <w:rFonts w:ascii="Verdana" w:hAnsi="Verdana"/>
           <w:sz w:val="22"/>
           <w:szCs w:val="22"/>
         </w:rPr>
-        <w:t>metioned</w:t>
-      </w:r>
-      <w:proofErr w:type="spellEnd"/>
+        <w:t>BATCH</w:t>
+      </w:r>
       <w:r>
         <w:rPr>
           <w:rFonts w:ascii="Verdana" w:hAnsi="Verdana"/>
           <w:sz w:val="22"/>
           <w:szCs w:val="22"/>
         </w:rPr>
-        <w:t xml:space="preserve"> </w:t>
+        <w:t xml:space="preserve"> Cards</w:t>
       </w:r>
       <w:r>
         <w:rPr>
@@ -2746,7 +3051,7 @@
           <w:sz w:val="22"/>
           <w:szCs w:val="22"/>
         </w:rPr>
-        <w:t>BATCH</w:t>
+        <w:t xml:space="preserve"> </w:t>
       </w:r>
       <w:r>
         <w:rPr>
@@ -2754,7 +3059,7 @@
           <w:sz w:val="22"/>
           <w:szCs w:val="22"/>
         </w:rPr>
-        <w:t xml:space="preserve"> Cards</w:t>
+        <w:t xml:space="preserve">received </w:t>
       </w:r>
       <w:r>
         <w:rPr>
@@ -2762,7 +3067,7 @@
           <w:sz w:val="22"/>
           <w:szCs w:val="22"/>
         </w:rPr>
-        <w:t xml:space="preserve"> </w:t>
+        <w:t>fro</w:t>
       </w:r>
       <w:r>
         <w:rPr>
@@ -2770,7 +3075,7 @@
           <w:sz w:val="22"/>
           <w:szCs w:val="22"/>
         </w:rPr>
-        <w:t xml:space="preserve">received </w:t>
+        <w:t xml:space="preserve">m </w:t>
       </w:r>
       <w:r>
         <w:rPr>
@@ -2778,33 +3083,7 @@
           <w:sz w:val="22"/>
           <w:szCs w:val="22"/>
         </w:rPr>
-        <w:t xml:space="preserve">from </w:t>
-      </w:r>
-      <w:r>
-        <w:rPr>
-          <w:rFonts w:ascii="Verdana" w:hAnsi="Verdana"/>
-          <w:b/>
-          <w:bCs/>
-          <w:sz w:val="22"/>
-          <w:szCs w:val="22"/>
-        </w:rPr>
-        <w:t>xxx</w:t>
-      </w:r>
-      <w:r>
-        <w:rPr>
-          <w:rFonts w:ascii="Verdana" w:hAnsi="Verdana"/>
-          <w:sz w:val="22"/>
-          <w:szCs w:val="22"/>
-        </w:rPr>
-        <w:t xml:space="preserve"> circle</w:t>
-      </w:r>
-      <w:r>
-        <w:rPr>
-          <w:rFonts w:ascii="Verdana" w:hAnsi="Verdana"/>
-          <w:sz w:val="22"/>
-          <w:szCs w:val="22"/>
-        </w:rPr>
-        <w:t>.</w:t>
+        <w:t>mentioned circle in the table.</w:t>
       </w:r>
       <w:r>
         <w:br w:type="page"/>
@@ -3249,11 +3528,16 @@
               <w:rPr>
                 <w:rFonts w:ascii="Verdana" w:hAnsi="Verdana" w:cs="Calibri"/>
                 <w:color w:val="000000"/>
-                <w:sz w:val="16"/>
-                <w:szCs w:val="16"/>
-              </w:rPr>
-            </w:pPr>
-            <w:r>
+                <w:sz w:val="18"/>
+                <w:szCs w:val="18"/>
+              </w:rPr>
+            </w:pPr>
+            <w:r>
+              <w:rPr>
+                <w:rFonts w:ascii="Verdana" w:hAnsi="Verdana"/>
+                <w:sz w:val="18"/>
+                <w:szCs w:val="18"/>
+              </w:rPr>
               <w:t>{#Online}{iccid}</w:t>
             </w:r>
           </w:p>
@@ -3277,20 +3561,17 @@
               <w:rPr>
                 <w:rFonts w:ascii="Verdana" w:hAnsi="Verdana" w:cs="Calibri"/>
                 <w:color w:val="000000"/>
-                <w:sz w:val="16"/>
-                <w:szCs w:val="16"/>
-              </w:rPr>
-            </w:pPr>
-            <w:r>
-              <w:t>{</w:t>
-            </w:r>
-            <w:proofErr w:type="spellStart"/>
-            <w:r>
-              <w:t>permanentImsi</w:t>
-            </w:r>
-            <w:proofErr w:type="spellEnd"/>
-            <w:r>
-              <w:t>}</w:t>
+                <w:sz w:val="18"/>
+                <w:szCs w:val="18"/>
+              </w:rPr>
+            </w:pPr>
+            <w:r>
+              <w:rPr>
+                <w:rFonts w:ascii="Verdana" w:hAnsi="Verdana"/>
+                <w:sz w:val="18"/>
+                <w:szCs w:val="18"/>
+              </w:rPr>
+              <w:t>{permanentImsi}</w:t>
             </w:r>
           </w:p>
         </w:tc>
@@ -3313,20 +3594,17 @@
               <w:rPr>
                 <w:rFonts w:ascii="Verdana" w:hAnsi="Verdana" w:cs="Calibri"/>
                 <w:color w:val="000000"/>
-                <w:sz w:val="16"/>
-                <w:szCs w:val="16"/>
-              </w:rPr>
-            </w:pPr>
-            <w:r>
-              <w:t>{</w:t>
-            </w:r>
-            <w:proofErr w:type="spellStart"/>
-            <w:r>
-              <w:t>msisdn</w:t>
-            </w:r>
-            <w:proofErr w:type="spellEnd"/>
-            <w:r>
-              <w:t>}{/Online}</w:t>
+                <w:sz w:val="18"/>
+                <w:szCs w:val="18"/>
+              </w:rPr>
+            </w:pPr>
+            <w:r>
+              <w:rPr>
+                <w:rFonts w:ascii="Verdana" w:hAnsi="Verdana"/>
+                <w:sz w:val="18"/>
+                <w:szCs w:val="18"/>
+              </w:rPr>
+              <w:t>{msisdn}{/Online}</w:t>
             </w:r>
           </w:p>
         </w:tc>
@@ -3549,12 +3827,9 @@
     </w:p>
     <w:p>
       <w:pPr>
-        <w:pStyle w:val="Heading3Numbered"/>
-        <w:numPr>
-          <w:ilvl w:val="0"/>
-          <w:numId w:val="0"/>
-        </w:numPr>
-        <w:spacing w:before="0"/>
+        <w:rPr>
+          <w:lang w:val="en-US" w:eastAsia="en-US" w:bidi="ne-NP"/>
+        </w:rPr>
       </w:pPr>
     </w:p>
     <w:p>
@@ -3566,107 +3841,22 @@
     </w:p>
     <w:tbl>
       <w:tblPr>
-        <w:tblW w:w="8897" w:type="dxa"/>
+        <w:tblW w:w="8746" w:type="dxa"/>
         <w:tblLook w:val="04A0" w:firstRow="1" w:lastRow="0" w:firstColumn="1" w:lastColumn="0" w:noHBand="0" w:noVBand="1"/>
       </w:tblPr>
       <w:tblGrid>
-        <w:gridCol w:w="2213"/>
-        <w:gridCol w:w="1083"/>
-        <w:gridCol w:w="1734"/>
-        <w:gridCol w:w="1401"/>
-        <w:gridCol w:w="2466"/>
+        <w:gridCol w:w="2436"/>
+        <w:gridCol w:w="2656"/>
+        <w:gridCol w:w="1365"/>
+        <w:gridCol w:w="2343"/>
       </w:tblGrid>
       <w:tr>
         <w:trPr>
-          <w:trHeight w:val="550"/>
+          <w:trHeight w:val="877"/>
         </w:trPr>
         <w:tc>
           <w:tcPr>
-            <w:tcW w:w="3323" w:type="dxa"/>
-            <w:gridSpan w:val="2"/>
-            <w:tcBorders>
-              <w:top w:val="single" w:sz="4" w:space="0" w:color="auto"/>
-              <w:left w:val="single" w:sz="4" w:space="0" w:color="auto"/>
-              <w:bottom w:val="single" w:sz="4" w:space="0" w:color="auto"/>
-              <w:right w:val="single" w:sz="4" w:space="0" w:color="000000"/>
-            </w:tcBorders>
-            <w:shd w:val="clear" w:color="5B9BD5" w:fill="5B9BD5"/>
-            <w:vAlign w:val="center"/>
-            <w:hideMark/>
-          </w:tcPr>
-          <w:p>
-            <w:pPr>
-              <w:jc w:val="center"/>
-              <w:rPr>
-                <w:rFonts w:ascii="Verdana" w:hAnsi="Verdana" w:cs="Calibri"/>
-                <w:b/>
-                <w:bCs/>
-                <w:color w:val="FFFFFF"/>
-                <w:sz w:val="16"/>
-                <w:szCs w:val="16"/>
-                <w:lang w:val="en-IN" w:eastAsia="en-IN"/>
-              </w:rPr>
-            </w:pPr>
-            <w:r>
-              <w:rPr>
-                <w:rFonts w:ascii="Verdana" w:hAnsi="Verdana" w:cs="Calibri"/>
-                <w:b/>
-                <w:bCs/>
-                <w:color w:val="FFFFFF"/>
-                <w:sz w:val="16"/>
-                <w:szCs w:val="16"/>
-              </w:rPr>
-              <w:t>Machine ID:   202111x</w:t>
-            </w:r>
-          </w:p>
-        </w:tc>
-        <w:tc>
-          <w:tcPr>
-            <w:tcW w:w="5574" w:type="dxa"/>
-            <w:gridSpan w:val="3"/>
-            <w:tcBorders>
-              <w:top w:val="single" w:sz="4" w:space="0" w:color="auto"/>
-              <w:left w:val="nil"/>
-              <w:bottom w:val="single" w:sz="4" w:space="0" w:color="auto"/>
-              <w:right w:val="single" w:sz="4" w:space="0" w:color="000000"/>
-            </w:tcBorders>
-            <w:shd w:val="clear" w:color="5B9BD5" w:fill="5B9BD5"/>
-            <w:vAlign w:val="center"/>
-            <w:hideMark/>
-          </w:tcPr>
-          <w:p>
-            <w:pPr>
-              <w:jc w:val="center"/>
-              <w:rPr>
-                <w:rFonts w:ascii="Verdana" w:hAnsi="Verdana" w:cs="Calibri"/>
-                <w:b/>
-                <w:bCs/>
-                <w:color w:val="FFFFFF"/>
-                <w:sz w:val="16"/>
-                <w:szCs w:val="16"/>
-              </w:rPr>
-            </w:pPr>
-            <w:r>
-              <w:rPr>
-                <w:rFonts w:ascii="Verdana" w:hAnsi="Verdana" w:cs="Calibri"/>
-                <w:b/>
-                <w:bCs/>
-                <w:color w:val="FFFFFF"/>
-                <w:sz w:val="16"/>
-                <w:szCs w:val="16"/>
-              </w:rPr>
-              <w:t>Go-no-Go Gauge [3FF &amp; 4FF] Testing (Slip Gauge)</w:t>
-            </w:r>
-          </w:p>
-        </w:tc>
-      </w:tr>
-      <w:tr>
-        <w:trPr>
-          <w:trHeight w:val="856"/>
-        </w:trPr>
-        <w:tc>
-          <w:tcPr>
-            <w:tcW w:w="987" w:type="dxa"/>
+            <w:tcW w:w="2436" w:type="dxa"/>
             <w:tcBorders>
               <w:top w:val="single" w:sz="4" w:space="0" w:color="auto"/>
               <w:left w:val="single" w:sz="4" w:space="0" w:color="auto"/>
@@ -3674,19 +3864,20 @@
               <w:right w:val="single" w:sz="4" w:space="0" w:color="auto"/>
             </w:tcBorders>
             <w:shd w:val="clear" w:color="5B9BD5" w:fill="5B9BD5"/>
+            <w:noWrap/>
             <w:vAlign w:val="center"/>
             <w:hideMark/>
           </w:tcPr>
           <w:p>
             <w:pPr>
-              <w:jc w:val="center"/>
               <w:rPr>
                 <w:rFonts w:ascii="Verdana" w:hAnsi="Verdana" w:cs="Calibri"/>
                 <w:b/>
                 <w:bCs/>
                 <w:color w:val="FFFFFF"/>
-                <w:sz w:val="16"/>
-                <w:szCs w:val="16"/>
+                <w:sz w:val="18"/>
+                <w:szCs w:val="18"/>
+                <w:lang w:val="en-US" w:eastAsia="en-US"/>
               </w:rPr>
             </w:pPr>
             <w:r>
@@ -3695,16 +3886,61 @@
                 <w:b/>
                 <w:bCs/>
                 <w:color w:val="FFFFFF"/>
-                <w:sz w:val="16"/>
-                <w:szCs w:val="16"/>
-              </w:rPr>
-              <w:t>Sr. No.</w:t>
-            </w:r>
-          </w:p>
-        </w:tc>
-        <w:tc>
-          <w:tcPr>
-            <w:tcW w:w="2336" w:type="dxa"/>
+                <w:sz w:val="18"/>
+                <w:szCs w:val="18"/>
+              </w:rPr>
+              <w:t>Machine ID:   202111x</w:t>
+            </w:r>
+          </w:p>
+        </w:tc>
+        <w:tc>
+          <w:tcPr>
+            <w:tcW w:w="6310" w:type="dxa"/>
+            <w:gridSpan w:val="3"/>
+            <w:tcBorders>
+              <w:top w:val="single" w:sz="4" w:space="0" w:color="auto"/>
+              <w:left w:val="nil"/>
+              <w:bottom w:val="single" w:sz="4" w:space="0" w:color="auto"/>
+              <w:right w:val="single" w:sz="4" w:space="0" w:color="auto"/>
+            </w:tcBorders>
+            <w:shd w:val="clear" w:color="5B9BD5" w:fill="5B9BD5"/>
+            <w:noWrap/>
+            <w:vAlign w:val="center"/>
+            <w:hideMark/>
+          </w:tcPr>
+          <w:p>
+            <w:pPr>
+              <w:jc w:val="center"/>
+              <w:rPr>
+                <w:rFonts w:ascii="Verdana" w:hAnsi="Verdana" w:cs="Calibri"/>
+                <w:b/>
+                <w:bCs/>
+                <w:color w:val="FFFFFF"/>
+                <w:sz w:val="18"/>
+                <w:szCs w:val="18"/>
+              </w:rPr>
+            </w:pPr>
+            <w:r>
+              <w:rPr>
+                <w:rFonts w:ascii="Verdana" w:hAnsi="Verdana" w:cs="Calibri"/>
+                <w:b/>
+                <w:bCs/>
+                <w:color w:val="FFFFFF"/>
+                <w:sz w:val="18"/>
+                <w:szCs w:val="18"/>
+              </w:rPr>
+              <w:t>Thickness Testing (Slip Gauge)</w:t>
+            </w:r>
+          </w:p>
+        </w:tc>
+      </w:tr>
+      <w:tr>
+        <w:trPr>
+          <w:trHeight w:val="1860"/>
+        </w:trPr>
+        <w:tc>
+          <w:tcPr>
+            <w:tcW w:w="2436" w:type="dxa"/>
             <w:tcBorders>
               <w:top w:val="single" w:sz="4" w:space="0" w:color="auto"/>
               <w:left w:val="single" w:sz="4" w:space="0" w:color="auto"/>
@@ -3712,6 +3948,7 @@
               <w:right w:val="single" w:sz="4" w:space="0" w:color="auto"/>
             </w:tcBorders>
             <w:shd w:val="clear" w:color="5B9BD5" w:fill="5B9BD5"/>
+            <w:noWrap/>
             <w:vAlign w:val="center"/>
             <w:hideMark/>
           </w:tcPr>
@@ -3723,8 +3960,8 @@
                 <w:b/>
                 <w:bCs/>
                 <w:color w:val="FFFFFF"/>
-                <w:sz w:val="16"/>
-                <w:szCs w:val="16"/>
+                <w:sz w:val="18"/>
+                <w:szCs w:val="18"/>
               </w:rPr>
             </w:pPr>
             <w:r>
@@ -3733,8 +3970,8 @@
                 <w:b/>
                 <w:bCs/>
                 <w:color w:val="FFFFFF"/>
-                <w:sz w:val="16"/>
-                <w:szCs w:val="16"/>
+                <w:sz w:val="18"/>
+                <w:szCs w:val="18"/>
               </w:rPr>
               <w:t>ICCID</w:t>
             </w:r>
@@ -3742,7 +3979,7 @@
         </w:tc>
         <w:tc>
           <w:tcPr>
-            <w:tcW w:w="2418" w:type="dxa"/>
+            <w:tcW w:w="2656" w:type="dxa"/>
             <w:tcBorders>
               <w:top w:val="single" w:sz="4" w:space="0" w:color="auto"/>
               <w:left w:val="single" w:sz="4" w:space="0" w:color="auto"/>
@@ -3761,8 +3998,8 @@
                 <w:b/>
                 <w:bCs/>
                 <w:color w:val="FFFFFF"/>
-                <w:sz w:val="16"/>
-                <w:szCs w:val="16"/>
+                <w:sz w:val="18"/>
+                <w:szCs w:val="18"/>
               </w:rPr>
             </w:pPr>
             <w:r>
@@ -3771,8 +4008,8 @@
                 <w:b/>
                 <w:bCs/>
                 <w:color w:val="FFFFFF"/>
-                <w:sz w:val="16"/>
-                <w:szCs w:val="16"/>
+                <w:sz w:val="18"/>
+                <w:szCs w:val="18"/>
               </w:rPr>
               <w:t>Specification</w:t>
             </w:r>
@@ -3782,8 +4019,8 @@
                 <w:b/>
                 <w:bCs/>
                 <w:color w:val="FFFFFF"/>
-                <w:sz w:val="16"/>
-                <w:szCs w:val="16"/>
+                <w:sz w:val="18"/>
+                <w:szCs w:val="18"/>
               </w:rPr>
               <w:br/>
               <w:t>(0.10 mm allowed on embossed cards included in max values allowed)</w:t>
@@ -3792,7 +4029,7 @@
         </w:tc>
         <w:tc>
           <w:tcPr>
-            <w:tcW w:w="1744" w:type="dxa"/>
+            <w:tcW w:w="1365" w:type="dxa"/>
             <w:tcBorders>
               <w:top w:val="single" w:sz="4" w:space="0" w:color="auto"/>
               <w:left w:val="single" w:sz="4" w:space="0" w:color="auto"/>
@@ -3811,8 +4048,8 @@
                 <w:b/>
                 <w:bCs/>
                 <w:color w:val="FFFFFF"/>
-                <w:sz w:val="16"/>
-                <w:szCs w:val="16"/>
+                <w:sz w:val="18"/>
+                <w:szCs w:val="18"/>
               </w:rPr>
             </w:pPr>
             <w:r>
@@ -3821,8 +4058,8 @@
                 <w:b/>
                 <w:bCs/>
                 <w:color w:val="FFFFFF"/>
-                <w:sz w:val="16"/>
-                <w:szCs w:val="16"/>
+                <w:sz w:val="18"/>
+                <w:szCs w:val="18"/>
               </w:rPr>
               <w:t>Observed Values</w:t>
             </w:r>
@@ -3832,8 +4069,8 @@
                 <w:b/>
                 <w:bCs/>
                 <w:color w:val="FFFFFF"/>
-                <w:sz w:val="16"/>
-                <w:szCs w:val="16"/>
+                <w:sz w:val="18"/>
+                <w:szCs w:val="18"/>
               </w:rPr>
               <w:br/>
               <w:t>(Chip Down)</w:t>
@@ -3842,7 +4079,7 @@
         </w:tc>
         <w:tc>
           <w:tcPr>
-            <w:tcW w:w="1412" w:type="dxa"/>
+            <w:tcW w:w="2288" w:type="dxa"/>
             <w:tcBorders>
               <w:top w:val="single" w:sz="4" w:space="0" w:color="auto"/>
               <w:left w:val="single" w:sz="4" w:space="0" w:color="auto"/>
@@ -3861,8 +4098,8 @@
                 <w:b/>
                 <w:bCs/>
                 <w:color w:val="FFFFFF"/>
-                <w:sz w:val="16"/>
-                <w:szCs w:val="16"/>
+                <w:sz w:val="18"/>
+                <w:szCs w:val="18"/>
               </w:rPr>
             </w:pPr>
             <w:r>
@@ -3871,42 +4108,30 @@
                 <w:b/>
                 <w:bCs/>
                 <w:color w:val="FFFFFF"/>
-                <w:sz w:val="16"/>
-                <w:szCs w:val="16"/>
+                <w:sz w:val="18"/>
+                <w:szCs w:val="18"/>
               </w:rPr>
               <w:t>Remarks</w:t>
-            </w:r>
-            <w:r>
-              <w:rPr>
-                <w:rFonts w:ascii="Verdana" w:hAnsi="Verdana" w:cs="Calibri"/>
-                <w:b/>
-                <w:bCs/>
-                <w:color w:val="FFFFFF"/>
-                <w:sz w:val="16"/>
-                <w:szCs w:val="16"/>
-              </w:rPr>
-              <w:br/>
-              <w:t>(OK/NOT OK)</w:t>
             </w:r>
           </w:p>
         </w:tc>
       </w:tr>
       <w:tr>
         <w:trPr>
-          <w:trHeight w:val="448"/>
+          <w:trHeight w:val="682"/>
         </w:trPr>
         <w:tc>
           <w:tcPr>
-            <w:tcW w:w="987" w:type="dxa"/>
+            <w:tcW w:w="2436" w:type="dxa"/>
             <w:tcBorders>
               <w:top w:val="single" w:sz="4" w:space="0" w:color="auto"/>
               <w:left w:val="single" w:sz="4" w:space="0" w:color="auto"/>
               <w:bottom w:val="single" w:sz="4" w:space="0" w:color="auto"/>
               <w:right w:val="single" w:sz="4" w:space="0" w:color="auto"/>
             </w:tcBorders>
-            <w:shd w:val="clear" w:color="BDD7EE" w:fill="BDD7EE"/>
-            <w:vAlign w:val="center"/>
-            <w:hideMark/>
+            <w:shd w:val="clear" w:color="DDEBF7" w:fill="DDEBF7"/>
+            <w:noWrap/>
+            <w:vAlign w:val="center"/>
           </w:tcPr>
           <w:p>
             <w:pPr>
@@ -3914,34 +4139,32 @@
               <w:rPr>
                 <w:rFonts w:ascii="Verdana" w:hAnsi="Verdana" w:cs="Calibri"/>
                 <w:color w:val="000000"/>
-                <w:sz w:val="16"/>
-                <w:szCs w:val="16"/>
-              </w:rPr>
-            </w:pPr>
-            <w:r>
-              <w:t>{#thickness}{srNo}</w:t>
-            </w:r>
-            <w:r>
-              <w:rPr>
-                <w:rFonts w:ascii="Verdana" w:hAnsi="Verdana" w:cs="Calibri"/>
-                <w:color w:val="000000"/>
-                <w:sz w:val="16"/>
-                <w:szCs w:val="16"/>
-              </w:rPr>
-              <w:t> </w:t>
-            </w:r>
-          </w:p>
-        </w:tc>
-        <w:tc>
-          <w:tcPr>
-            <w:tcW w:w="2336" w:type="dxa"/>
+                <w:sz w:val="18"/>
+                <w:szCs w:val="18"/>
+              </w:rPr>
+            </w:pPr>
+            <w:r>
+              <w:rPr>
+                <w:rFonts w:ascii="Verdana" w:hAnsi="Verdana" w:cs="Calibri"/>
+                <w:color w:val="000000"/>
+                <w:sz w:val="18"/>
+                <w:szCs w:val="18"/>
+              </w:rPr>
+              <w:t>{#thickness}{iccid}</w:t>
+            </w:r>
+          </w:p>
+        </w:tc>
+        <w:tc>
+          <w:tcPr>
+            <w:tcW w:w="2656" w:type="dxa"/>
             <w:tcBorders>
               <w:top w:val="single" w:sz="4" w:space="0" w:color="auto"/>
               <w:left w:val="single" w:sz="4" w:space="0" w:color="auto"/>
               <w:bottom w:val="single" w:sz="4" w:space="0" w:color="auto"/>
               <w:right w:val="single" w:sz="4" w:space="0" w:color="auto"/>
             </w:tcBorders>
-            <w:shd w:val="clear" w:color="BDD7EE" w:fill="BDD7EE"/>
+            <w:shd w:val="clear" w:color="DDEBF7" w:fill="DDEBF7"/>
+            <w:noWrap/>
             <w:vAlign w:val="center"/>
             <w:hideMark/>
           </w:tcPr>
@@ -3951,44 +4174,33 @@
               <w:rPr>
                 <w:rFonts w:ascii="Verdana" w:hAnsi="Verdana" w:cs="Calibri"/>
                 <w:color w:val="000000"/>
-                <w:sz w:val="16"/>
-                <w:szCs w:val="16"/>
-              </w:rPr>
-            </w:pPr>
-            <w:r>
-              <w:t>{</w:t>
-            </w:r>
-            <w:proofErr w:type="spellStart"/>
-            <w:r>
-              <w:t>iccid</w:t>
-            </w:r>
-            <w:proofErr w:type="spellEnd"/>
-            <w:r>
-              <w:t>}</w:t>
-            </w:r>
-            <w:r>
-              <w:rPr>
-                <w:rFonts w:ascii="Verdana" w:hAnsi="Verdana" w:cs="Calibri"/>
-                <w:color w:val="000000"/>
-                <w:sz w:val="16"/>
-                <w:szCs w:val="16"/>
-              </w:rPr>
-              <w:t> </w:t>
-            </w:r>
-          </w:p>
-        </w:tc>
-        <w:tc>
-          <w:tcPr>
-            <w:tcW w:w="2418" w:type="dxa"/>
+                <w:sz w:val="18"/>
+                <w:szCs w:val="18"/>
+              </w:rPr>
+            </w:pPr>
+            <w:r>
+              <w:rPr>
+                <w:rFonts w:ascii="Verdana" w:hAnsi="Verdana" w:cs="Calibri"/>
+                <w:color w:val="000000"/>
+                <w:sz w:val="18"/>
+                <w:szCs w:val="18"/>
+              </w:rPr>
+              <w:t>{specification}</w:t>
+            </w:r>
+          </w:p>
+        </w:tc>
+        <w:tc>
+          <w:tcPr>
+            <w:tcW w:w="1365" w:type="dxa"/>
             <w:tcBorders>
               <w:top w:val="single" w:sz="4" w:space="0" w:color="auto"/>
               <w:left w:val="single" w:sz="4" w:space="0" w:color="auto"/>
               <w:bottom w:val="single" w:sz="4" w:space="0" w:color="auto"/>
               <w:right w:val="single" w:sz="4" w:space="0" w:color="auto"/>
             </w:tcBorders>
-            <w:shd w:val="clear" w:color="BDD7EE" w:fill="BDD7EE"/>
-            <w:vAlign w:val="center"/>
-            <w:hideMark/>
+            <w:shd w:val="clear" w:color="DDEBF7" w:fill="DDEBF7"/>
+            <w:noWrap/>
+            <w:vAlign w:val="center"/>
           </w:tcPr>
           <w:p>
             <w:pPr>
@@ -3996,27 +4208,32 @@
               <w:rPr>
                 <w:rFonts w:ascii="Verdana" w:hAnsi="Verdana" w:cs="Calibri"/>
                 <w:color w:val="000000"/>
-                <w:sz w:val="16"/>
-                <w:szCs w:val="16"/>
-              </w:rPr>
-            </w:pPr>
-            <w:r>
-              <w:t>{specification}</w:t>
-            </w:r>
-          </w:p>
-        </w:tc>
-        <w:tc>
-          <w:tcPr>
-            <w:tcW w:w="1744" w:type="dxa"/>
+                <w:sz w:val="18"/>
+                <w:szCs w:val="18"/>
+              </w:rPr>
+            </w:pPr>
+            <w:r>
+              <w:rPr>
+                <w:rFonts w:ascii="Verdana" w:hAnsi="Verdana" w:cs="Calibri"/>
+                <w:color w:val="000000"/>
+                <w:sz w:val="18"/>
+                <w:szCs w:val="18"/>
+              </w:rPr>
+              <w:t>{observed}</w:t>
+            </w:r>
+          </w:p>
+        </w:tc>
+        <w:tc>
+          <w:tcPr>
+            <w:tcW w:w="2288" w:type="dxa"/>
             <w:tcBorders>
               <w:top w:val="single" w:sz="4" w:space="0" w:color="auto"/>
               <w:left w:val="single" w:sz="4" w:space="0" w:color="auto"/>
               <w:bottom w:val="single" w:sz="4" w:space="0" w:color="auto"/>
               <w:right w:val="single" w:sz="4" w:space="0" w:color="auto"/>
             </w:tcBorders>
-            <w:shd w:val="clear" w:color="BDD7EE" w:fill="BDD7EE"/>
-            <w:vAlign w:val="center"/>
-            <w:hideMark/>
+            <w:shd w:val="clear" w:color="DDEBF7" w:fill="DDEBF7"/>
+            <w:vAlign w:val="center"/>
           </w:tcPr>
           <w:p>
             <w:pPr>
@@ -4024,77 +4241,23 @@
               <w:rPr>
                 <w:rFonts w:ascii="Verdana" w:hAnsi="Verdana" w:cs="Calibri"/>
                 <w:color w:val="000000"/>
-                <w:sz w:val="16"/>
-                <w:szCs w:val="16"/>
-              </w:rPr>
-            </w:pPr>
-            <w:r>
-              <w:t>{observed}</w:t>
-            </w:r>
-            <w:r>
-              <w:rPr>
-                <w:rFonts w:ascii="Verdana" w:hAnsi="Verdana" w:cs="Calibri"/>
-                <w:color w:val="000000"/>
-                <w:sz w:val="16"/>
-                <w:szCs w:val="16"/>
-              </w:rPr>
-              <w:t> </w:t>
-            </w:r>
-          </w:p>
-        </w:tc>
-        <w:tc>
-          <w:tcPr>
-            <w:tcW w:w="1412" w:type="dxa"/>
-            <w:tcBorders>
-              <w:top w:val="single" w:sz="4" w:space="0" w:color="auto"/>
-              <w:left w:val="single" w:sz="4" w:space="0" w:color="auto"/>
-              <w:bottom w:val="single" w:sz="4" w:space="0" w:color="auto"/>
-              <w:right w:val="single" w:sz="4" w:space="0" w:color="auto"/>
-            </w:tcBorders>
-            <w:shd w:val="clear" w:color="BDD7EE" w:fill="BDD7EE"/>
-            <w:vAlign w:val="center"/>
-            <w:hideMark/>
-          </w:tcPr>
-          <w:p>
-            <w:pPr>
-              <w:jc w:val="center"/>
-              <w:rPr>
-                <w:rFonts w:ascii="Verdana" w:hAnsi="Verdana" w:cs="Calibri"/>
-                <w:color w:val="000000"/>
-                <w:sz w:val="16"/>
-                <w:szCs w:val="16"/>
-              </w:rPr>
-            </w:pPr>
-            <w:r>
+                <w:sz w:val="18"/>
+                <w:szCs w:val="18"/>
+              </w:rPr>
+            </w:pPr>
+            <w:r>
+              <w:rPr>
+                <w:rFonts w:ascii="Verdana" w:hAnsi="Verdana" w:cs="Calibri"/>
+                <w:color w:val="000000"/>
+                <w:sz w:val="18"/>
+                <w:szCs w:val="18"/>
+              </w:rPr>
               <w:t>{remarks}{/thickness}</w:t>
-            </w:r>
-            <w:r>
-              <w:rPr>
-                <w:rFonts w:ascii="Verdana" w:hAnsi="Verdana" w:cs="Calibri"/>
-                <w:color w:val="000000"/>
-                <w:sz w:val="16"/>
-                <w:szCs w:val="16"/>
-              </w:rPr>
-              <w:t> </w:t>
             </w:r>
           </w:p>
         </w:tc>
       </w:tr>
     </w:tbl>
-    <w:p>
-      <w:pPr>
-        <w:rPr>
-          <w:lang w:val="en-US" w:eastAsia="en-US" w:bidi="ne-NP"/>
-        </w:rPr>
-      </w:pPr>
-    </w:p>
-    <w:p>
-      <w:pPr>
-        <w:rPr>
-          <w:lang w:val="en-US" w:eastAsia="en-US" w:bidi="ne-NP"/>
-        </w:rPr>
-      </w:pPr>
-    </w:p>
     <w:p>
       <w:pPr>
         <w:rPr>
@@ -4147,7 +4310,7 @@
         <w:gridCol w:w="3293"/>
         <w:gridCol w:w="1888"/>
         <w:gridCol w:w="1685"/>
-        <w:gridCol w:w="2267"/>
+        <w:gridCol w:w="2160"/>
       </w:tblGrid>
       <w:tr>
         <w:trPr>
@@ -4391,11 +4554,16 @@
               <w:rPr>
                 <w:rFonts w:ascii="Verdana" w:hAnsi="Verdana" w:cs="Calibri"/>
                 <w:color w:val="000000"/>
-                <w:sz w:val="16"/>
-                <w:szCs w:val="16"/>
-              </w:rPr>
-            </w:pPr>
-            <w:r>
+                <w:sz w:val="18"/>
+                <w:szCs w:val="18"/>
+              </w:rPr>
+            </w:pPr>
+            <w:r>
+              <w:rPr>
+                <w:rFonts w:ascii="Verdana" w:hAnsi="Verdana"/>
+                <w:sz w:val="18"/>
+                <w:szCs w:val="18"/>
+              </w:rPr>
               <w:t>{#goNoGo}{iccid}</w:t>
             </w:r>
           </w:p>
@@ -4420,11 +4588,16 @@
               <w:rPr>
                 <w:rFonts w:ascii="Verdana" w:hAnsi="Verdana" w:cs="Calibri"/>
                 <w:color w:val="000000"/>
-                <w:sz w:val="16"/>
-                <w:szCs w:val="16"/>
-              </w:rPr>
-            </w:pPr>
-            <w:r>
+                <w:sz w:val="18"/>
+                <w:szCs w:val="18"/>
+              </w:rPr>
+            </w:pPr>
+            <w:r>
+              <w:rPr>
+                <w:rFonts w:ascii="Verdana" w:hAnsi="Verdana"/>
+                <w:sz w:val="18"/>
+                <w:szCs w:val="18"/>
+              </w:rPr>
               <w:t>{parameter}</w:t>
             </w:r>
           </w:p>
@@ -4449,11 +4622,16 @@
               <w:rPr>
                 <w:rFonts w:ascii="Verdana" w:hAnsi="Verdana" w:cs="Calibri"/>
                 <w:color w:val="000000"/>
-                <w:sz w:val="16"/>
-                <w:szCs w:val="16"/>
-              </w:rPr>
-            </w:pPr>
-            <w:r>
+                <w:sz w:val="18"/>
+                <w:szCs w:val="18"/>
+              </w:rPr>
+            </w:pPr>
+            <w:r>
+              <w:rPr>
+                <w:rFonts w:ascii="Verdana" w:hAnsi="Verdana"/>
+                <w:sz w:val="18"/>
+                <w:szCs w:val="18"/>
+              </w:rPr>
               <w:t>{specification}</w:t>
             </w:r>
           </w:p>
@@ -4478,27 +4656,24 @@
               <w:rPr>
                 <w:rFonts w:ascii="Verdana" w:hAnsi="Verdana" w:cs="Calibri"/>
                 <w:color w:val="000000"/>
-                <w:sz w:val="16"/>
-                <w:szCs w:val="16"/>
-              </w:rPr>
-            </w:pPr>
-            <w:r>
-              <w:t>{passed}{/</w:t>
-            </w:r>
-            <w:proofErr w:type="spellStart"/>
-            <w:r>
-              <w:t>goNoGo</w:t>
-            </w:r>
-            <w:proofErr w:type="spellEnd"/>
-            <w:r>
-              <w:t>}</w:t>
-            </w:r>
-            <w:r>
-              <w:rPr>
-                <w:rFonts w:ascii="Verdana" w:hAnsi="Verdana" w:cs="Calibri"/>
-                <w:color w:val="000000"/>
-                <w:sz w:val="16"/>
-                <w:szCs w:val="16"/>
+                <w:sz w:val="18"/>
+                <w:szCs w:val="18"/>
+              </w:rPr>
+            </w:pPr>
+            <w:r>
+              <w:rPr>
+                <w:rFonts w:ascii="Verdana" w:hAnsi="Verdana"/>
+                <w:sz w:val="18"/>
+                <w:szCs w:val="18"/>
+              </w:rPr>
+              <w:t>{passed}{/goNoGo}</w:t>
+            </w:r>
+            <w:r>
+              <w:rPr>
+                <w:rFonts w:ascii="Verdana" w:hAnsi="Verdana" w:cs="Calibri"/>
+                <w:color w:val="000000"/>
+                <w:sz w:val="18"/>
+                <w:szCs w:val="18"/>
               </w:rPr>
               <w:t> </w:t>
             </w:r>
@@ -4555,15 +4730,7 @@
         <w:t xml:space="preserve">Applications </w:t>
       </w:r>
       <w:r>
-        <w:t xml:space="preserve">&amp; </w:t>
-      </w:r>
-      <w:proofErr w:type="spellStart"/>
-      <w:r>
-        <w:t>Necessery</w:t>
-      </w:r>
-      <w:proofErr w:type="spellEnd"/>
-      <w:r>
-        <w:t xml:space="preserve"> DF </w:t>
+        <w:t xml:space="preserve">&amp; Necessery DF </w:t>
       </w:r>
       <w:r>
         <w:t xml:space="preserve">on </w:t>
@@ -6774,11 +6941,9 @@
         <w:lastRenderedPageBreak/>
         <w:t xml:space="preserve">Voltage Testing </w:t>
       </w:r>
-      <w:proofErr w:type="gramStart"/>
       <w:r>
         <w:t>on</w:t>
       </w:r>
-      <w:proofErr w:type="gramEnd"/>
       <w:r>
         <w:t xml:space="preserve"> Class A, B and C</w:t>
       </w:r>
@@ -6863,788 +7028,6 @@
         </w:rPr>
       </w:pPr>
     </w:p>
-    <w:p>
-      <w:pPr>
-        <w:rPr>
-          <w:lang w:val="en-US" w:eastAsia="en-US" w:bidi="ne-NP"/>
-        </w:rPr>
-      </w:pPr>
-    </w:p>
-    <w:tbl>
-      <w:tblPr>
-        <w:tblW w:w="8416" w:type="dxa"/>
-        <w:tblLook w:val="04A0" w:firstRow="1" w:lastRow="0" w:firstColumn="1" w:lastColumn="0" w:noHBand="0" w:noVBand="1"/>
-      </w:tblPr>
-      <w:tblGrid>
-        <w:gridCol w:w="1530"/>
-        <w:gridCol w:w="1256"/>
-        <w:gridCol w:w="868"/>
-        <w:gridCol w:w="857"/>
-        <w:gridCol w:w="857"/>
-        <w:gridCol w:w="827"/>
-        <w:gridCol w:w="798"/>
-        <w:gridCol w:w="1722"/>
-      </w:tblGrid>
-      <w:tr>
-        <w:trPr>
-          <w:trHeight w:val="879"/>
-        </w:trPr>
-        <w:tc>
-          <w:tcPr>
-            <w:tcW w:w="2089" w:type="dxa"/>
-            <w:gridSpan w:val="2"/>
-            <w:tcBorders>
-              <w:top w:val="single" w:sz="4" w:space="0" w:color="auto"/>
-              <w:left w:val="single" w:sz="4" w:space="0" w:color="auto"/>
-              <w:bottom w:val="single" w:sz="4" w:space="0" w:color="auto"/>
-              <w:right w:val="single" w:sz="4" w:space="0" w:color="auto"/>
-            </w:tcBorders>
-            <w:shd w:val="clear" w:color="5B9BD5" w:fill="5B9BD5"/>
-            <w:noWrap/>
-            <w:vAlign w:val="center"/>
-            <w:hideMark/>
-          </w:tcPr>
-          <w:p>
-            <w:pPr>
-              <w:jc w:val="center"/>
-              <w:rPr>
-                <w:rFonts w:ascii="Verdana" w:hAnsi="Verdana" w:cs="Calibri"/>
-                <w:b/>
-                <w:bCs/>
-                <w:color w:val="FFFFFF"/>
-                <w:sz w:val="16"/>
-                <w:szCs w:val="16"/>
-                <w:lang w:val="en-IN" w:eastAsia="en-IN"/>
-              </w:rPr>
-            </w:pPr>
-            <w:r>
-              <w:rPr>
-                <w:rFonts w:ascii="Verdana" w:hAnsi="Verdana" w:cs="Calibri"/>
-                <w:b/>
-                <w:bCs/>
-                <w:color w:val="FFFFFF"/>
-                <w:sz w:val="16"/>
-                <w:szCs w:val="16"/>
-              </w:rPr>
-              <w:t>{</w:t>
-            </w:r>
-            <w:proofErr w:type="spellStart"/>
-            <w:r>
-              <w:rPr>
-                <w:rFonts w:ascii="Verdana" w:hAnsi="Verdana" w:cs="Calibri"/>
-                <w:b/>
-                <w:bCs/>
-                <w:color w:val="FFFFFF"/>
-                <w:sz w:val="16"/>
-                <w:szCs w:val="16"/>
-              </w:rPr>
-              <w:t>workOrder</w:t>
-            </w:r>
-            <w:proofErr w:type="spellEnd"/>
-            <w:r>
-              <w:rPr>
-                <w:rFonts w:ascii="Verdana" w:hAnsi="Verdana" w:cs="Calibri"/>
-                <w:b/>
-                <w:bCs/>
-                <w:color w:val="FFFFFF"/>
-                <w:sz w:val="16"/>
-                <w:szCs w:val="16"/>
-              </w:rPr>
-              <w:t>}</w:t>
-            </w:r>
-          </w:p>
-        </w:tc>
-        <w:tc>
-          <w:tcPr>
-            <w:tcW w:w="2637" w:type="dxa"/>
-            <w:gridSpan w:val="3"/>
-            <w:tcBorders>
-              <w:top w:val="single" w:sz="4" w:space="0" w:color="auto"/>
-              <w:left w:val="nil"/>
-              <w:bottom w:val="single" w:sz="4" w:space="0" w:color="auto"/>
-              <w:right w:val="single" w:sz="4" w:space="0" w:color="auto"/>
-            </w:tcBorders>
-            <w:shd w:val="clear" w:color="5B9BD5" w:fill="5B9BD5"/>
-            <w:noWrap/>
-            <w:vAlign w:val="center"/>
-            <w:hideMark/>
-          </w:tcPr>
-          <w:p>
-            <w:pPr>
-              <w:jc w:val="center"/>
-              <w:rPr>
-                <w:rFonts w:ascii="Verdana" w:hAnsi="Verdana" w:cs="Calibri"/>
-                <w:b/>
-                <w:bCs/>
-                <w:color w:val="FFFFFF"/>
-                <w:sz w:val="16"/>
-                <w:szCs w:val="16"/>
-              </w:rPr>
-            </w:pPr>
-            <w:r>
-              <w:rPr>
-                <w:rFonts w:ascii="Verdana" w:hAnsi="Verdana" w:cs="Calibri"/>
-                <w:b/>
-                <w:bCs/>
-                <w:color w:val="FFFFFF"/>
-                <w:sz w:val="16"/>
-                <w:szCs w:val="16"/>
-              </w:rPr>
-              <w:t>Voltage Parameter (+-10 %)</w:t>
-            </w:r>
-          </w:p>
-        </w:tc>
-        <w:tc>
-          <w:tcPr>
-            <w:tcW w:w="3690" w:type="dxa"/>
-            <w:gridSpan w:val="3"/>
-            <w:tcBorders>
-              <w:top w:val="single" w:sz="4" w:space="0" w:color="auto"/>
-              <w:left w:val="nil"/>
-              <w:bottom w:val="single" w:sz="4" w:space="0" w:color="auto"/>
-              <w:right w:val="single" w:sz="4" w:space="0" w:color="auto"/>
-            </w:tcBorders>
-            <w:shd w:val="clear" w:color="5B9BD5" w:fill="5B9BD5"/>
-            <w:noWrap/>
-            <w:vAlign w:val="center"/>
-            <w:hideMark/>
-          </w:tcPr>
-          <w:p>
-            <w:pPr>
-              <w:jc w:val="center"/>
-              <w:rPr>
-                <w:rFonts w:ascii="Verdana" w:hAnsi="Verdana" w:cs="Calibri"/>
-                <w:b/>
-                <w:bCs/>
-                <w:color w:val="FFFFFF"/>
-                <w:sz w:val="16"/>
-                <w:szCs w:val="16"/>
-              </w:rPr>
-            </w:pPr>
-            <w:r>
-              <w:rPr>
-                <w:rFonts w:ascii="Verdana" w:hAnsi="Verdana" w:cs="Calibri"/>
-                <w:b/>
-                <w:bCs/>
-                <w:color w:val="FFFFFF"/>
-                <w:sz w:val="16"/>
-                <w:szCs w:val="16"/>
-              </w:rPr>
-              <w:t>Observed Value</w:t>
-            </w:r>
-          </w:p>
-        </w:tc>
-      </w:tr>
-      <w:tr>
-        <w:trPr>
-          <w:trHeight w:val="879"/>
-        </w:trPr>
-        <w:tc>
-          <w:tcPr>
-            <w:tcW w:w="482" w:type="dxa"/>
-            <w:tcBorders>
-              <w:top w:val="single" w:sz="4" w:space="0" w:color="auto"/>
-              <w:left w:val="single" w:sz="4" w:space="0" w:color="auto"/>
-              <w:bottom w:val="single" w:sz="4" w:space="0" w:color="auto"/>
-              <w:right w:val="single" w:sz="4" w:space="0" w:color="auto"/>
-            </w:tcBorders>
-            <w:shd w:val="clear" w:color="5B9BD5" w:fill="5B9BD5"/>
-            <w:noWrap/>
-            <w:vAlign w:val="center"/>
-            <w:hideMark/>
-          </w:tcPr>
-          <w:p>
-            <w:pPr>
-              <w:jc w:val="center"/>
-              <w:rPr>
-                <w:rFonts w:ascii="Verdana" w:hAnsi="Verdana" w:cs="Calibri"/>
-                <w:b/>
-                <w:bCs/>
-                <w:color w:val="FFFFFF"/>
-                <w:sz w:val="16"/>
-                <w:szCs w:val="16"/>
-              </w:rPr>
-            </w:pPr>
-            <w:r>
-              <w:rPr>
-                <w:rFonts w:ascii="Verdana" w:hAnsi="Verdana" w:cs="Calibri"/>
-                <w:b/>
-                <w:bCs/>
-                <w:color w:val="FFFFFF"/>
-                <w:sz w:val="16"/>
-                <w:szCs w:val="16"/>
-              </w:rPr>
-              <w:t>Sr. No.</w:t>
-            </w:r>
-          </w:p>
-        </w:tc>
-        <w:tc>
-          <w:tcPr>
-            <w:tcW w:w="1606" w:type="dxa"/>
-            <w:tcBorders>
-              <w:top w:val="single" w:sz="4" w:space="0" w:color="auto"/>
-              <w:left w:val="single" w:sz="4" w:space="0" w:color="auto"/>
-              <w:bottom w:val="single" w:sz="4" w:space="0" w:color="auto"/>
-              <w:right w:val="single" w:sz="4" w:space="0" w:color="auto"/>
-            </w:tcBorders>
-            <w:shd w:val="clear" w:color="5B9BD5" w:fill="5B9BD5"/>
-            <w:noWrap/>
-            <w:vAlign w:val="center"/>
-            <w:hideMark/>
-          </w:tcPr>
-          <w:p>
-            <w:pPr>
-              <w:jc w:val="center"/>
-              <w:rPr>
-                <w:rFonts w:ascii="Verdana" w:hAnsi="Verdana" w:cs="Calibri"/>
-                <w:b/>
-                <w:bCs/>
-                <w:color w:val="FFFFFF"/>
-                <w:sz w:val="16"/>
-                <w:szCs w:val="16"/>
-              </w:rPr>
-            </w:pPr>
-            <w:r>
-              <w:rPr>
-                <w:rFonts w:ascii="Verdana" w:hAnsi="Verdana" w:cs="Calibri"/>
-                <w:b/>
-                <w:bCs/>
-                <w:color w:val="FFFFFF"/>
-                <w:sz w:val="16"/>
-                <w:szCs w:val="16"/>
-              </w:rPr>
-              <w:t>ICCID</w:t>
-            </w:r>
-          </w:p>
-        </w:tc>
-        <w:tc>
-          <w:tcPr>
-            <w:tcW w:w="886" w:type="dxa"/>
-            <w:tcBorders>
-              <w:top w:val="single" w:sz="4" w:space="0" w:color="auto"/>
-              <w:left w:val="single" w:sz="4" w:space="0" w:color="auto"/>
-              <w:bottom w:val="single" w:sz="4" w:space="0" w:color="auto"/>
-              <w:right w:val="single" w:sz="4" w:space="0" w:color="auto"/>
-            </w:tcBorders>
-            <w:shd w:val="clear" w:color="5B9BD5" w:fill="5B9BD5"/>
-            <w:vAlign w:val="center"/>
-            <w:hideMark/>
-          </w:tcPr>
-          <w:p>
-            <w:pPr>
-              <w:jc w:val="center"/>
-              <w:rPr>
-                <w:rFonts w:ascii="Verdana" w:hAnsi="Verdana" w:cs="Calibri"/>
-                <w:b/>
-                <w:bCs/>
-                <w:color w:val="FFFFFF"/>
-                <w:sz w:val="16"/>
-                <w:szCs w:val="16"/>
-              </w:rPr>
-            </w:pPr>
-            <w:r>
-              <w:rPr>
-                <w:rFonts w:ascii="Verdana" w:hAnsi="Verdana" w:cs="Calibri"/>
-                <w:b/>
-                <w:bCs/>
-                <w:color w:val="FFFFFF"/>
-                <w:sz w:val="16"/>
-                <w:szCs w:val="16"/>
-              </w:rPr>
-              <w:t>Class A</w:t>
-            </w:r>
-          </w:p>
-        </w:tc>
-        <w:tc>
-          <w:tcPr>
-            <w:tcW w:w="875" w:type="dxa"/>
-            <w:tcBorders>
-              <w:top w:val="single" w:sz="4" w:space="0" w:color="auto"/>
-              <w:left w:val="single" w:sz="4" w:space="0" w:color="auto"/>
-              <w:bottom w:val="single" w:sz="4" w:space="0" w:color="auto"/>
-              <w:right w:val="single" w:sz="4" w:space="0" w:color="auto"/>
-            </w:tcBorders>
-            <w:shd w:val="clear" w:color="5B9BD5" w:fill="5B9BD5"/>
-            <w:vAlign w:val="center"/>
-            <w:hideMark/>
-          </w:tcPr>
-          <w:p>
-            <w:pPr>
-              <w:jc w:val="center"/>
-              <w:rPr>
-                <w:rFonts w:ascii="Verdana" w:hAnsi="Verdana" w:cs="Calibri"/>
-                <w:b/>
-                <w:bCs/>
-                <w:color w:val="FFFFFF"/>
-                <w:sz w:val="16"/>
-                <w:szCs w:val="16"/>
-              </w:rPr>
-            </w:pPr>
-            <w:r>
-              <w:rPr>
-                <w:rFonts w:ascii="Verdana" w:hAnsi="Verdana" w:cs="Calibri"/>
-                <w:b/>
-                <w:bCs/>
-                <w:color w:val="FFFFFF"/>
-                <w:sz w:val="16"/>
-                <w:szCs w:val="16"/>
-              </w:rPr>
-              <w:t>Class B</w:t>
-            </w:r>
-          </w:p>
-        </w:tc>
-        <w:tc>
-          <w:tcPr>
-            <w:tcW w:w="875" w:type="dxa"/>
-            <w:tcBorders>
-              <w:top w:val="single" w:sz="4" w:space="0" w:color="auto"/>
-              <w:left w:val="single" w:sz="4" w:space="0" w:color="auto"/>
-              <w:bottom w:val="single" w:sz="4" w:space="0" w:color="auto"/>
-              <w:right w:val="single" w:sz="4" w:space="0" w:color="auto"/>
-            </w:tcBorders>
-            <w:shd w:val="clear" w:color="5B9BD5" w:fill="5B9BD5"/>
-            <w:vAlign w:val="center"/>
-            <w:hideMark/>
-          </w:tcPr>
-          <w:p>
-            <w:pPr>
-              <w:jc w:val="center"/>
-              <w:rPr>
-                <w:rFonts w:ascii="Verdana" w:hAnsi="Verdana" w:cs="Calibri"/>
-                <w:b/>
-                <w:bCs/>
-                <w:color w:val="FFFFFF"/>
-                <w:sz w:val="16"/>
-                <w:szCs w:val="16"/>
-              </w:rPr>
-            </w:pPr>
-            <w:r>
-              <w:rPr>
-                <w:rFonts w:ascii="Verdana" w:hAnsi="Verdana" w:cs="Calibri"/>
-                <w:b/>
-                <w:bCs/>
-                <w:color w:val="FFFFFF"/>
-                <w:sz w:val="16"/>
-                <w:szCs w:val="16"/>
-              </w:rPr>
-              <w:t>Class C</w:t>
-            </w:r>
-          </w:p>
-        </w:tc>
-        <w:tc>
-          <w:tcPr>
-            <w:tcW w:w="842" w:type="dxa"/>
-            <w:tcBorders>
-              <w:top w:val="single" w:sz="4" w:space="0" w:color="auto"/>
-              <w:left w:val="single" w:sz="4" w:space="0" w:color="auto"/>
-              <w:bottom w:val="single" w:sz="4" w:space="0" w:color="auto"/>
-              <w:right w:val="single" w:sz="4" w:space="0" w:color="auto"/>
-            </w:tcBorders>
-            <w:shd w:val="clear" w:color="5B9BD5" w:fill="5B9BD5"/>
-            <w:noWrap/>
-            <w:vAlign w:val="center"/>
-            <w:hideMark/>
-          </w:tcPr>
-          <w:p>
-            <w:pPr>
-              <w:jc w:val="center"/>
-              <w:rPr>
-                <w:rFonts w:ascii="Verdana" w:hAnsi="Verdana" w:cs="Calibri"/>
-                <w:b/>
-                <w:bCs/>
-                <w:color w:val="FFFFFF"/>
-                <w:sz w:val="16"/>
-                <w:szCs w:val="16"/>
-              </w:rPr>
-            </w:pPr>
-            <w:r>
-              <w:rPr>
-                <w:rFonts w:ascii="Verdana" w:hAnsi="Verdana" w:cs="Calibri"/>
-                <w:b/>
-                <w:bCs/>
-                <w:color w:val="FFFFFF"/>
-                <w:sz w:val="16"/>
-                <w:szCs w:val="16"/>
-              </w:rPr>
-              <w:t>Max V</w:t>
-            </w:r>
-          </w:p>
-        </w:tc>
-        <w:tc>
-          <w:tcPr>
-            <w:tcW w:w="810" w:type="dxa"/>
-            <w:tcBorders>
-              <w:top w:val="single" w:sz="4" w:space="0" w:color="auto"/>
-              <w:left w:val="single" w:sz="4" w:space="0" w:color="auto"/>
-              <w:bottom w:val="single" w:sz="4" w:space="0" w:color="auto"/>
-              <w:right w:val="single" w:sz="4" w:space="0" w:color="auto"/>
-            </w:tcBorders>
-            <w:shd w:val="clear" w:color="5B9BD5" w:fill="5B9BD5"/>
-            <w:noWrap/>
-            <w:vAlign w:val="center"/>
-            <w:hideMark/>
-          </w:tcPr>
-          <w:p>
-            <w:pPr>
-              <w:jc w:val="center"/>
-              <w:rPr>
-                <w:rFonts w:ascii="Verdana" w:hAnsi="Verdana" w:cs="Calibri"/>
-                <w:b/>
-                <w:bCs/>
-                <w:color w:val="FFFFFF"/>
-                <w:sz w:val="16"/>
-                <w:szCs w:val="16"/>
-              </w:rPr>
-            </w:pPr>
-            <w:r>
-              <w:rPr>
-                <w:rFonts w:ascii="Verdana" w:hAnsi="Verdana" w:cs="Calibri"/>
-                <w:b/>
-                <w:bCs/>
-                <w:color w:val="FFFFFF"/>
-                <w:sz w:val="16"/>
-                <w:szCs w:val="16"/>
-              </w:rPr>
-              <w:t>Min V</w:t>
-            </w:r>
-          </w:p>
-        </w:tc>
-        <w:tc>
-          <w:tcPr>
-            <w:tcW w:w="2036" w:type="dxa"/>
-            <w:tcBorders>
-              <w:top w:val="single" w:sz="4" w:space="0" w:color="auto"/>
-              <w:left w:val="single" w:sz="4" w:space="0" w:color="auto"/>
-              <w:bottom w:val="single" w:sz="4" w:space="0" w:color="auto"/>
-              <w:right w:val="single" w:sz="4" w:space="0" w:color="auto"/>
-            </w:tcBorders>
-            <w:shd w:val="clear" w:color="5B9BD5" w:fill="5B9BD5"/>
-            <w:noWrap/>
-            <w:vAlign w:val="center"/>
-            <w:hideMark/>
-          </w:tcPr>
-          <w:p>
-            <w:pPr>
-              <w:jc w:val="center"/>
-              <w:rPr>
-                <w:rFonts w:ascii="Verdana" w:hAnsi="Verdana" w:cs="Calibri"/>
-                <w:b/>
-                <w:bCs/>
-                <w:color w:val="FFFFFF"/>
-                <w:sz w:val="16"/>
-                <w:szCs w:val="16"/>
-              </w:rPr>
-            </w:pPr>
-            <w:r>
-              <w:rPr>
-                <w:rFonts w:ascii="Verdana" w:hAnsi="Verdana" w:cs="Calibri"/>
-                <w:b/>
-                <w:bCs/>
-                <w:color w:val="FFFFFF"/>
-                <w:sz w:val="16"/>
-                <w:szCs w:val="16"/>
-              </w:rPr>
-              <w:t>Remark</w:t>
-            </w:r>
-          </w:p>
-        </w:tc>
-      </w:tr>
-      <w:tr>
-        <w:trPr>
-          <w:trHeight w:val="879"/>
-        </w:trPr>
-        <w:tc>
-          <w:tcPr>
-            <w:tcW w:w="482" w:type="dxa"/>
-            <w:tcBorders>
-              <w:top w:val="single" w:sz="4" w:space="0" w:color="auto"/>
-              <w:left w:val="single" w:sz="4" w:space="0" w:color="auto"/>
-              <w:bottom w:val="single" w:sz="4" w:space="0" w:color="auto"/>
-              <w:right w:val="single" w:sz="4" w:space="0" w:color="auto"/>
-            </w:tcBorders>
-            <w:shd w:val="clear" w:color="DDEBF7" w:fill="DDEBF7"/>
-            <w:noWrap/>
-            <w:vAlign w:val="center"/>
-          </w:tcPr>
-          <w:p>
-            <w:pPr>
-              <w:jc w:val="center"/>
-              <w:rPr>
-                <w:rFonts w:ascii="Verdana" w:hAnsi="Verdana" w:cs="Calibri"/>
-                <w:color w:val="000000"/>
-                <w:sz w:val="16"/>
-                <w:szCs w:val="16"/>
-              </w:rPr>
-            </w:pPr>
-            <w:r>
-              <w:t>{#voltage}{srNo}</w:t>
-            </w:r>
-          </w:p>
-        </w:tc>
-        <w:tc>
-          <w:tcPr>
-            <w:tcW w:w="1606" w:type="dxa"/>
-            <w:tcBorders>
-              <w:top w:val="single" w:sz="4" w:space="0" w:color="auto"/>
-              <w:left w:val="single" w:sz="4" w:space="0" w:color="auto"/>
-              <w:bottom w:val="single" w:sz="4" w:space="0" w:color="auto"/>
-              <w:right w:val="single" w:sz="4" w:space="0" w:color="auto"/>
-            </w:tcBorders>
-            <w:shd w:val="clear" w:color="DDEBF7" w:fill="DDEBF7"/>
-            <w:noWrap/>
-            <w:vAlign w:val="center"/>
-          </w:tcPr>
-          <w:p>
-            <w:pPr>
-              <w:jc w:val="center"/>
-              <w:rPr>
-                <w:rFonts w:ascii="Verdana" w:hAnsi="Verdana" w:cs="Calibri"/>
-                <w:color w:val="000000"/>
-                <w:sz w:val="16"/>
-                <w:szCs w:val="16"/>
-              </w:rPr>
-            </w:pPr>
-            <w:r>
-              <w:t>{</w:t>
-            </w:r>
-            <w:proofErr w:type="spellStart"/>
-            <w:r>
-              <w:t>iccid</w:t>
-            </w:r>
-            <w:proofErr w:type="spellEnd"/>
-            <w:r>
-              <w:t>}</w:t>
-            </w:r>
-          </w:p>
-        </w:tc>
-        <w:tc>
-          <w:tcPr>
-            <w:tcW w:w="886" w:type="dxa"/>
-            <w:tcBorders>
-              <w:top w:val="single" w:sz="4" w:space="0" w:color="auto"/>
-              <w:left w:val="single" w:sz="4" w:space="0" w:color="auto"/>
-              <w:bottom w:val="single" w:sz="4" w:space="0" w:color="auto"/>
-              <w:right w:val="single" w:sz="4" w:space="0" w:color="auto"/>
-            </w:tcBorders>
-            <w:shd w:val="clear" w:color="DDEBF7" w:fill="DDEBF7"/>
-            <w:noWrap/>
-            <w:vAlign w:val="center"/>
-            <w:hideMark/>
-          </w:tcPr>
-          <w:p>
-            <w:pPr>
-              <w:jc w:val="center"/>
-              <w:rPr>
-                <w:rFonts w:ascii="Verdana" w:hAnsi="Verdana" w:cs="Calibri"/>
-                <w:color w:val="000000"/>
-                <w:sz w:val="16"/>
-                <w:szCs w:val="16"/>
-                <w:u w:val="single"/>
-              </w:rPr>
-            </w:pPr>
-            <w:r>
-              <w:t>{</w:t>
-            </w:r>
-            <w:proofErr w:type="spellStart"/>
-            <w:r>
-              <w:t>classA</w:t>
-            </w:r>
-            <w:proofErr w:type="spellEnd"/>
-            <w:r>
-              <w:t>}</w:t>
-            </w:r>
-          </w:p>
-        </w:tc>
-        <w:tc>
-          <w:tcPr>
-            <w:tcW w:w="875" w:type="dxa"/>
-            <w:tcBorders>
-              <w:top w:val="single" w:sz="4" w:space="0" w:color="auto"/>
-              <w:left w:val="single" w:sz="4" w:space="0" w:color="auto"/>
-              <w:bottom w:val="single" w:sz="4" w:space="0" w:color="auto"/>
-              <w:right w:val="single" w:sz="4" w:space="0" w:color="auto"/>
-            </w:tcBorders>
-            <w:shd w:val="clear" w:color="DDEBF7" w:fill="DDEBF7"/>
-            <w:noWrap/>
-            <w:vAlign w:val="center"/>
-            <w:hideMark/>
-          </w:tcPr>
-          <w:p>
-            <w:pPr>
-              <w:jc w:val="center"/>
-              <w:rPr>
-                <w:rFonts w:ascii="Verdana" w:hAnsi="Verdana" w:cs="Calibri"/>
-                <w:color w:val="000000"/>
-                <w:sz w:val="16"/>
-                <w:szCs w:val="16"/>
-                <w:u w:val="single"/>
-              </w:rPr>
-            </w:pPr>
-            <w:r>
-              <w:t>{</w:t>
-            </w:r>
-            <w:proofErr w:type="spellStart"/>
-            <w:r>
-              <w:t>classB</w:t>
-            </w:r>
-            <w:proofErr w:type="spellEnd"/>
-            <w:r>
-              <w:t>}</w:t>
-            </w:r>
-          </w:p>
-        </w:tc>
-        <w:tc>
-          <w:tcPr>
-            <w:tcW w:w="875" w:type="dxa"/>
-            <w:tcBorders>
-              <w:top w:val="single" w:sz="4" w:space="0" w:color="auto"/>
-              <w:left w:val="single" w:sz="4" w:space="0" w:color="auto"/>
-              <w:bottom w:val="single" w:sz="4" w:space="0" w:color="auto"/>
-              <w:right w:val="single" w:sz="4" w:space="0" w:color="auto"/>
-            </w:tcBorders>
-            <w:shd w:val="clear" w:color="DDEBF7" w:fill="DDEBF7"/>
-            <w:noWrap/>
-            <w:vAlign w:val="center"/>
-            <w:hideMark/>
-          </w:tcPr>
-          <w:p>
-            <w:pPr>
-              <w:jc w:val="center"/>
-              <w:rPr>
-                <w:rFonts w:ascii="Verdana" w:hAnsi="Verdana" w:cs="Calibri"/>
-                <w:color w:val="000000"/>
-                <w:sz w:val="16"/>
-                <w:szCs w:val="16"/>
-                <w:u w:val="single"/>
-              </w:rPr>
-            </w:pPr>
-            <w:r>
-              <w:t>{</w:t>
-            </w:r>
-            <w:proofErr w:type="spellStart"/>
-            <w:r>
-              <w:t>classC</w:t>
-            </w:r>
-            <w:proofErr w:type="spellEnd"/>
-            <w:r>
-              <w:t>}</w:t>
-            </w:r>
-          </w:p>
-        </w:tc>
-        <w:tc>
-          <w:tcPr>
-            <w:tcW w:w="842" w:type="dxa"/>
-            <w:tcBorders>
-              <w:top w:val="single" w:sz="4" w:space="0" w:color="auto"/>
-              <w:left w:val="single" w:sz="4" w:space="0" w:color="auto"/>
-              <w:bottom w:val="single" w:sz="4" w:space="0" w:color="auto"/>
-              <w:right w:val="single" w:sz="4" w:space="0" w:color="auto"/>
-            </w:tcBorders>
-            <w:shd w:val="clear" w:color="DDEBF7" w:fill="DDEBF7"/>
-            <w:noWrap/>
-            <w:vAlign w:val="center"/>
-            <w:hideMark/>
-          </w:tcPr>
-          <w:p>
-            <w:pPr>
-              <w:jc w:val="center"/>
-              <w:rPr>
-                <w:rFonts w:ascii="Verdana" w:hAnsi="Verdana" w:cs="Calibri"/>
-                <w:color w:val="000000"/>
-                <w:sz w:val="16"/>
-                <w:szCs w:val="16"/>
-                <w:u w:val="single"/>
-              </w:rPr>
-            </w:pPr>
-            <w:r>
-              <w:t>{</w:t>
-            </w:r>
-            <w:proofErr w:type="spellStart"/>
-            <w:r>
-              <w:t>maxV</w:t>
-            </w:r>
-            <w:proofErr w:type="spellEnd"/>
-            <w:r>
-              <w:t>}</w:t>
-            </w:r>
-          </w:p>
-        </w:tc>
-        <w:tc>
-          <w:tcPr>
-            <w:tcW w:w="810" w:type="dxa"/>
-            <w:tcBorders>
-              <w:top w:val="single" w:sz="4" w:space="0" w:color="auto"/>
-              <w:left w:val="single" w:sz="4" w:space="0" w:color="auto"/>
-              <w:bottom w:val="single" w:sz="4" w:space="0" w:color="auto"/>
-              <w:right w:val="single" w:sz="4" w:space="0" w:color="auto"/>
-            </w:tcBorders>
-            <w:shd w:val="clear" w:color="DDEBF7" w:fill="DDEBF7"/>
-            <w:noWrap/>
-            <w:vAlign w:val="center"/>
-            <w:hideMark/>
-          </w:tcPr>
-          <w:p>
-            <w:pPr>
-              <w:jc w:val="center"/>
-              <w:rPr>
-                <w:rFonts w:ascii="Verdana" w:hAnsi="Verdana"/>
-                <w:sz w:val="16"/>
-                <w:szCs w:val="16"/>
-              </w:rPr>
-            </w:pPr>
-            <w:r>
-              <w:t>{</w:t>
-            </w:r>
-            <w:proofErr w:type="spellStart"/>
-            <w:r>
-              <w:t>minV</w:t>
-            </w:r>
-            <w:proofErr w:type="spellEnd"/>
-            <w:r>
-              <w:t>}</w:t>
-            </w:r>
-          </w:p>
-        </w:tc>
-        <w:tc>
-          <w:tcPr>
-            <w:tcW w:w="2036" w:type="dxa"/>
-            <w:tcBorders>
-              <w:top w:val="single" w:sz="4" w:space="0" w:color="auto"/>
-              <w:left w:val="single" w:sz="4" w:space="0" w:color="auto"/>
-              <w:bottom w:val="single" w:sz="4" w:space="0" w:color="auto"/>
-              <w:right w:val="single" w:sz="4" w:space="0" w:color="auto"/>
-            </w:tcBorders>
-            <w:shd w:val="clear" w:color="DDEBF7" w:fill="DDEBF7"/>
-            <w:noWrap/>
-            <w:vAlign w:val="center"/>
-            <w:hideMark/>
-          </w:tcPr>
-          <w:p>
-            <w:pPr>
-              <w:jc w:val="center"/>
-              <w:rPr>
-                <w:lang w:val="en-IN" w:eastAsia="en-IN"/>
-              </w:rPr>
-            </w:pPr>
-            <w:r>
-              <w:rPr>
-                <w:rStyle w:val="HTMLCode"/>
-                <w:rFonts w:ascii="Times New Roman" w:hAnsi="Times New Roman" w:cs="Times New Roman"/>
-                <w:sz w:val="24"/>
-                <w:szCs w:val="24"/>
-              </w:rPr>
-              <w:t>{remarks}{/voltage</w:t>
-            </w:r>
-            <w:r>
-              <w:rPr>
-                <w:rStyle w:val="HTMLCode"/>
-              </w:rPr>
-              <w:t>}</w:t>
-            </w:r>
-          </w:p>
-        </w:tc>
-      </w:tr>
-    </w:tbl>
     <w:p>
       <w:pPr>
         <w:shd w:val="clear" w:color="auto" w:fill="FFFFFF"/>
@@ -7675,6 +7058,650 @@
         </w:rPr>
       </w:pPr>
     </w:p>
+    <w:tbl>
+      <w:tblPr>
+        <w:tblW w:w="9133" w:type="dxa"/>
+        <w:tblLook w:val="04A0" w:firstRow="1" w:lastRow="0" w:firstColumn="1" w:lastColumn="0" w:noHBand="0" w:noVBand="1"/>
+      </w:tblPr>
+      <w:tblGrid>
+        <w:gridCol w:w="2155"/>
+        <w:gridCol w:w="1080"/>
+        <w:gridCol w:w="1007"/>
+        <w:gridCol w:w="1010"/>
+        <w:gridCol w:w="990"/>
+        <w:gridCol w:w="1080"/>
+        <w:gridCol w:w="1811"/>
+      </w:tblGrid>
+      <w:tr>
+        <w:trPr>
+          <w:trHeight w:val="1155"/>
+        </w:trPr>
+        <w:tc>
+          <w:tcPr>
+            <w:tcW w:w="5252" w:type="dxa"/>
+            <w:gridSpan w:val="4"/>
+            <w:tcBorders>
+              <w:top w:val="single" w:sz="4" w:space="0" w:color="auto"/>
+              <w:left w:val="single" w:sz="4" w:space="0" w:color="auto"/>
+              <w:bottom w:val="single" w:sz="4" w:space="0" w:color="auto"/>
+              <w:right w:val="single" w:sz="4" w:space="0" w:color="000000"/>
+            </w:tcBorders>
+            <w:shd w:val="clear" w:color="5B9BD5" w:fill="5B9BD5"/>
+            <w:noWrap/>
+            <w:vAlign w:val="center"/>
+            <w:hideMark/>
+          </w:tcPr>
+          <w:p>
+            <w:pPr>
+              <w:jc w:val="center"/>
+              <w:rPr>
+                <w:rFonts w:ascii="Verdana" w:hAnsi="Verdana" w:cs="Calibri"/>
+                <w:b/>
+                <w:bCs/>
+                <w:color w:val="FFFFFF"/>
+                <w:sz w:val="18"/>
+                <w:szCs w:val="18"/>
+                <w:lang w:val="en-US" w:eastAsia="en-US"/>
+              </w:rPr>
+            </w:pPr>
+            <w:bookmarkStart w:id="32" w:name="_Toc62828403"/>
+            <w:r>
+              <w:rPr>
+                <w:rFonts w:ascii="Verdana" w:hAnsi="Verdana" w:cs="Calibri"/>
+                <w:b/>
+                <w:bCs/>
+                <w:color w:val="FFFFFF"/>
+                <w:sz w:val="18"/>
+                <w:szCs w:val="18"/>
+              </w:rPr>
+              <w:t>Voltage Parameter (+-10 %)</w:t>
+            </w:r>
+          </w:p>
+        </w:tc>
+        <w:tc>
+          <w:tcPr>
+            <w:tcW w:w="3881" w:type="dxa"/>
+            <w:gridSpan w:val="3"/>
+            <w:tcBorders>
+              <w:top w:val="single" w:sz="4" w:space="0" w:color="auto"/>
+              <w:left w:val="single" w:sz="4" w:space="0" w:color="auto"/>
+              <w:bottom w:val="single" w:sz="4" w:space="0" w:color="auto"/>
+              <w:right w:val="single" w:sz="4" w:space="0" w:color="auto"/>
+            </w:tcBorders>
+            <w:shd w:val="clear" w:color="5B9BD5" w:fill="5B9BD5"/>
+            <w:noWrap/>
+            <w:vAlign w:val="center"/>
+            <w:hideMark/>
+          </w:tcPr>
+          <w:p>
+            <w:pPr>
+              <w:jc w:val="center"/>
+              <w:rPr>
+                <w:rFonts w:ascii="Verdana" w:hAnsi="Verdana" w:cs="Calibri"/>
+                <w:b/>
+                <w:bCs/>
+                <w:color w:val="FFFFFF"/>
+                <w:sz w:val="18"/>
+                <w:szCs w:val="18"/>
+              </w:rPr>
+            </w:pPr>
+            <w:r>
+              <w:rPr>
+                <w:rFonts w:ascii="Verdana" w:hAnsi="Verdana" w:cs="Calibri"/>
+                <w:b/>
+                <w:bCs/>
+                <w:color w:val="FFFFFF"/>
+                <w:sz w:val="18"/>
+                <w:szCs w:val="18"/>
+              </w:rPr>
+              <w:t>Observed Value</w:t>
+            </w:r>
+          </w:p>
+        </w:tc>
+      </w:tr>
+      <w:tr>
+        <w:trPr>
+          <w:trHeight w:val="1155"/>
+        </w:trPr>
+        <w:tc>
+          <w:tcPr>
+            <w:tcW w:w="2155" w:type="dxa"/>
+            <w:tcBorders>
+              <w:top w:val="single" w:sz="4" w:space="0" w:color="auto"/>
+              <w:left w:val="single" w:sz="4" w:space="0" w:color="auto"/>
+              <w:bottom w:val="single" w:sz="4" w:space="0" w:color="auto"/>
+              <w:right w:val="single" w:sz="4" w:space="0" w:color="auto"/>
+            </w:tcBorders>
+            <w:shd w:val="clear" w:color="5B9BD5" w:fill="5B9BD5"/>
+            <w:noWrap/>
+            <w:vAlign w:val="center"/>
+            <w:hideMark/>
+          </w:tcPr>
+          <w:p>
+            <w:pPr>
+              <w:jc w:val="center"/>
+              <w:rPr>
+                <w:rFonts w:ascii="Verdana" w:hAnsi="Verdana" w:cs="Calibri"/>
+                <w:b/>
+                <w:bCs/>
+                <w:color w:val="FFFFFF"/>
+                <w:sz w:val="18"/>
+                <w:szCs w:val="18"/>
+              </w:rPr>
+            </w:pPr>
+            <w:r>
+              <w:rPr>
+                <w:rFonts w:ascii="Verdana" w:hAnsi="Verdana" w:cs="Calibri"/>
+                <w:b/>
+                <w:bCs/>
+                <w:color w:val="FFFFFF"/>
+                <w:sz w:val="18"/>
+                <w:szCs w:val="18"/>
+              </w:rPr>
+              <w:t>ICCID</w:t>
+            </w:r>
+          </w:p>
+        </w:tc>
+        <w:tc>
+          <w:tcPr>
+            <w:tcW w:w="1080" w:type="dxa"/>
+            <w:tcBorders>
+              <w:top w:val="single" w:sz="4" w:space="0" w:color="auto"/>
+              <w:left w:val="single" w:sz="4" w:space="0" w:color="auto"/>
+              <w:bottom w:val="single" w:sz="4" w:space="0" w:color="auto"/>
+              <w:right w:val="single" w:sz="4" w:space="0" w:color="auto"/>
+            </w:tcBorders>
+            <w:shd w:val="clear" w:color="5B9BD5" w:fill="5B9BD5"/>
+            <w:noWrap/>
+            <w:vAlign w:val="center"/>
+            <w:hideMark/>
+          </w:tcPr>
+          <w:p>
+            <w:pPr>
+              <w:jc w:val="center"/>
+              <w:rPr>
+                <w:rFonts w:ascii="Verdana" w:hAnsi="Verdana" w:cs="Calibri"/>
+                <w:b/>
+                <w:bCs/>
+                <w:color w:val="FFFFFF"/>
+                <w:sz w:val="18"/>
+                <w:szCs w:val="18"/>
+              </w:rPr>
+            </w:pPr>
+            <w:r>
+              <w:rPr>
+                <w:rFonts w:ascii="Verdana" w:hAnsi="Verdana" w:cs="Calibri"/>
+                <w:b/>
+                <w:bCs/>
+                <w:color w:val="FFFFFF"/>
+                <w:sz w:val="18"/>
+                <w:szCs w:val="18"/>
+              </w:rPr>
+              <w:t>Class A</w:t>
+            </w:r>
+          </w:p>
+        </w:tc>
+        <w:tc>
+          <w:tcPr>
+            <w:tcW w:w="1007" w:type="dxa"/>
+            <w:tcBorders>
+              <w:top w:val="single" w:sz="4" w:space="0" w:color="auto"/>
+              <w:left w:val="single" w:sz="4" w:space="0" w:color="auto"/>
+              <w:bottom w:val="single" w:sz="4" w:space="0" w:color="auto"/>
+              <w:right w:val="single" w:sz="4" w:space="0" w:color="auto"/>
+            </w:tcBorders>
+            <w:shd w:val="clear" w:color="5B9BD5" w:fill="5B9BD5"/>
+            <w:noWrap/>
+            <w:vAlign w:val="center"/>
+            <w:hideMark/>
+          </w:tcPr>
+          <w:p>
+            <w:pPr>
+              <w:jc w:val="center"/>
+              <w:rPr>
+                <w:rFonts w:ascii="Verdana" w:hAnsi="Verdana" w:cs="Calibri"/>
+                <w:b/>
+                <w:bCs/>
+                <w:color w:val="FFFFFF"/>
+                <w:sz w:val="18"/>
+                <w:szCs w:val="18"/>
+              </w:rPr>
+            </w:pPr>
+            <w:r>
+              <w:rPr>
+                <w:rFonts w:ascii="Verdana" w:hAnsi="Verdana" w:cs="Calibri"/>
+                <w:b/>
+                <w:bCs/>
+                <w:color w:val="FFFFFF"/>
+                <w:sz w:val="18"/>
+                <w:szCs w:val="18"/>
+              </w:rPr>
+              <w:t>Class B</w:t>
+            </w:r>
+          </w:p>
+        </w:tc>
+        <w:tc>
+          <w:tcPr>
+            <w:tcW w:w="1010" w:type="dxa"/>
+            <w:tcBorders>
+              <w:top w:val="single" w:sz="4" w:space="0" w:color="auto"/>
+              <w:left w:val="single" w:sz="4" w:space="0" w:color="auto"/>
+              <w:bottom w:val="single" w:sz="4" w:space="0" w:color="auto"/>
+              <w:right w:val="single" w:sz="4" w:space="0" w:color="auto"/>
+            </w:tcBorders>
+            <w:shd w:val="clear" w:color="5B9BD5" w:fill="5B9BD5"/>
+            <w:noWrap/>
+            <w:vAlign w:val="center"/>
+            <w:hideMark/>
+          </w:tcPr>
+          <w:p>
+            <w:pPr>
+              <w:jc w:val="center"/>
+              <w:rPr>
+                <w:rFonts w:ascii="Verdana" w:hAnsi="Verdana" w:cs="Calibri"/>
+                <w:b/>
+                <w:bCs/>
+                <w:color w:val="FFFFFF"/>
+                <w:sz w:val="18"/>
+                <w:szCs w:val="18"/>
+              </w:rPr>
+            </w:pPr>
+            <w:r>
+              <w:rPr>
+                <w:rFonts w:ascii="Verdana" w:hAnsi="Verdana" w:cs="Calibri"/>
+                <w:b/>
+                <w:bCs/>
+                <w:color w:val="FFFFFF"/>
+                <w:sz w:val="18"/>
+                <w:szCs w:val="18"/>
+              </w:rPr>
+              <w:t>Class C</w:t>
+            </w:r>
+          </w:p>
+        </w:tc>
+        <w:tc>
+          <w:tcPr>
+            <w:tcW w:w="990" w:type="dxa"/>
+            <w:tcBorders>
+              <w:top w:val="single" w:sz="4" w:space="0" w:color="auto"/>
+              <w:left w:val="single" w:sz="4" w:space="0" w:color="auto"/>
+              <w:bottom w:val="single" w:sz="4" w:space="0" w:color="auto"/>
+              <w:right w:val="single" w:sz="4" w:space="0" w:color="auto"/>
+            </w:tcBorders>
+            <w:shd w:val="clear" w:color="5B9BD5" w:fill="5B9BD5"/>
+            <w:noWrap/>
+            <w:vAlign w:val="center"/>
+            <w:hideMark/>
+          </w:tcPr>
+          <w:p>
+            <w:pPr>
+              <w:jc w:val="center"/>
+              <w:rPr>
+                <w:rFonts w:ascii="Verdana" w:hAnsi="Verdana" w:cs="Calibri"/>
+                <w:b/>
+                <w:bCs/>
+                <w:color w:val="FFFFFF"/>
+                <w:sz w:val="18"/>
+                <w:szCs w:val="18"/>
+              </w:rPr>
+            </w:pPr>
+            <w:r>
+              <w:rPr>
+                <w:rFonts w:ascii="Verdana" w:hAnsi="Verdana" w:cs="Calibri"/>
+                <w:b/>
+                <w:bCs/>
+                <w:color w:val="FFFFFF"/>
+                <w:sz w:val="18"/>
+                <w:szCs w:val="18"/>
+              </w:rPr>
+              <w:t>Max V</w:t>
+            </w:r>
+          </w:p>
+        </w:tc>
+        <w:tc>
+          <w:tcPr>
+            <w:tcW w:w="1080" w:type="dxa"/>
+            <w:tcBorders>
+              <w:top w:val="single" w:sz="4" w:space="0" w:color="auto"/>
+              <w:left w:val="single" w:sz="4" w:space="0" w:color="auto"/>
+              <w:bottom w:val="single" w:sz="4" w:space="0" w:color="auto"/>
+              <w:right w:val="single" w:sz="4" w:space="0" w:color="auto"/>
+            </w:tcBorders>
+            <w:shd w:val="clear" w:color="5B9BD5" w:fill="5B9BD5"/>
+            <w:noWrap/>
+            <w:vAlign w:val="center"/>
+            <w:hideMark/>
+          </w:tcPr>
+          <w:p>
+            <w:pPr>
+              <w:jc w:val="center"/>
+              <w:rPr>
+                <w:rFonts w:ascii="Verdana" w:hAnsi="Verdana" w:cs="Calibri"/>
+                <w:b/>
+                <w:bCs/>
+                <w:color w:val="FFFFFF"/>
+                <w:sz w:val="18"/>
+                <w:szCs w:val="18"/>
+              </w:rPr>
+            </w:pPr>
+            <w:r>
+              <w:rPr>
+                <w:rFonts w:ascii="Verdana" w:hAnsi="Verdana" w:cs="Calibri"/>
+                <w:b/>
+                <w:bCs/>
+                <w:color w:val="FFFFFF"/>
+                <w:sz w:val="18"/>
+                <w:szCs w:val="18"/>
+              </w:rPr>
+              <w:t>Min V</w:t>
+            </w:r>
+          </w:p>
+        </w:tc>
+        <w:tc>
+          <w:tcPr>
+            <w:tcW w:w="1811" w:type="dxa"/>
+            <w:tcBorders>
+              <w:top w:val="single" w:sz="4" w:space="0" w:color="auto"/>
+              <w:left w:val="single" w:sz="4" w:space="0" w:color="auto"/>
+              <w:bottom w:val="single" w:sz="4" w:space="0" w:color="auto"/>
+              <w:right w:val="single" w:sz="4" w:space="0" w:color="auto"/>
+            </w:tcBorders>
+            <w:shd w:val="clear" w:color="5B9BD5" w:fill="5B9BD5"/>
+            <w:noWrap/>
+            <w:vAlign w:val="center"/>
+            <w:hideMark/>
+          </w:tcPr>
+          <w:p>
+            <w:pPr>
+              <w:jc w:val="center"/>
+              <w:rPr>
+                <w:rFonts w:ascii="Verdana" w:hAnsi="Verdana" w:cs="Calibri"/>
+                <w:b/>
+                <w:bCs/>
+                <w:color w:val="FFFFFF"/>
+                <w:sz w:val="18"/>
+                <w:szCs w:val="18"/>
+              </w:rPr>
+            </w:pPr>
+            <w:r>
+              <w:rPr>
+                <w:rFonts w:ascii="Verdana" w:hAnsi="Verdana" w:cs="Calibri"/>
+                <w:b/>
+                <w:bCs/>
+                <w:color w:val="FFFFFF"/>
+                <w:sz w:val="18"/>
+                <w:szCs w:val="18"/>
+              </w:rPr>
+              <w:t>Remarks</w:t>
+            </w:r>
+          </w:p>
+        </w:tc>
+      </w:tr>
+      <w:tr>
+        <w:trPr>
+          <w:trHeight w:val="898"/>
+        </w:trPr>
+        <w:tc>
+          <w:tcPr>
+            <w:tcW w:w="2155" w:type="dxa"/>
+            <w:tcBorders>
+              <w:top w:val="single" w:sz="4" w:space="0" w:color="auto"/>
+              <w:left w:val="single" w:sz="4" w:space="0" w:color="auto"/>
+              <w:bottom w:val="single" w:sz="4" w:space="0" w:color="auto"/>
+              <w:right w:val="single" w:sz="4" w:space="0" w:color="auto"/>
+            </w:tcBorders>
+            <w:shd w:val="clear" w:color="DDEBF7" w:fill="DDEBF7"/>
+            <w:noWrap/>
+            <w:vAlign w:val="center"/>
+          </w:tcPr>
+          <w:p>
+            <w:pPr>
+              <w:jc w:val="center"/>
+              <w:rPr>
+                <w:rFonts w:ascii="Verdana" w:hAnsi="Verdana" w:cs="Calibri"/>
+                <w:color w:val="000000"/>
+                <w:sz w:val="18"/>
+                <w:szCs w:val="18"/>
+              </w:rPr>
+            </w:pPr>
+            <w:r>
+              <w:rPr>
+                <w:rFonts w:ascii="Verdana" w:hAnsi="Verdana"/>
+                <w:sz w:val="18"/>
+                <w:szCs w:val="18"/>
+              </w:rPr>
+              <w:t>{#voltage}{iccid}</w:t>
+            </w:r>
+          </w:p>
+        </w:tc>
+        <w:tc>
+          <w:tcPr>
+            <w:tcW w:w="1080" w:type="dxa"/>
+            <w:tcBorders>
+              <w:top w:val="single" w:sz="4" w:space="0" w:color="auto"/>
+              <w:left w:val="single" w:sz="4" w:space="0" w:color="auto"/>
+              <w:bottom w:val="single" w:sz="4" w:space="0" w:color="auto"/>
+              <w:right w:val="single" w:sz="4" w:space="0" w:color="auto"/>
+            </w:tcBorders>
+            <w:shd w:val="clear" w:color="DDEBF7" w:fill="DDEBF7"/>
+            <w:noWrap/>
+            <w:vAlign w:val="center"/>
+          </w:tcPr>
+          <w:p>
+            <w:pPr>
+              <w:jc w:val="center"/>
+              <w:rPr>
+                <w:rFonts w:ascii="Verdana" w:hAnsi="Verdana" w:cs="Calibri"/>
+                <w:color w:val="000000"/>
+                <w:sz w:val="18"/>
+                <w:szCs w:val="18"/>
+              </w:rPr>
+            </w:pPr>
+            <w:r>
+              <w:rPr>
+                <w:rFonts w:ascii="Verdana" w:hAnsi="Verdana"/>
+                <w:sz w:val="18"/>
+                <w:szCs w:val="18"/>
+              </w:rPr>
+              <w:t>{classA}</w:t>
+            </w:r>
+          </w:p>
+        </w:tc>
+        <w:tc>
+          <w:tcPr>
+            <w:tcW w:w="1007" w:type="dxa"/>
+            <w:tcBorders>
+              <w:top w:val="single" w:sz="4" w:space="0" w:color="auto"/>
+              <w:left w:val="single" w:sz="4" w:space="0" w:color="auto"/>
+              <w:bottom w:val="single" w:sz="4" w:space="0" w:color="auto"/>
+              <w:right w:val="single" w:sz="4" w:space="0" w:color="auto"/>
+            </w:tcBorders>
+            <w:shd w:val="clear" w:color="DDEBF7" w:fill="DDEBF7"/>
+            <w:noWrap/>
+            <w:vAlign w:val="center"/>
+          </w:tcPr>
+          <w:p>
+            <w:pPr>
+              <w:jc w:val="center"/>
+              <w:rPr>
+                <w:rFonts w:ascii="Verdana" w:hAnsi="Verdana" w:cs="Calibri"/>
+                <w:color w:val="000000"/>
+                <w:sz w:val="18"/>
+                <w:szCs w:val="18"/>
+              </w:rPr>
+            </w:pPr>
+            <w:r>
+              <w:rPr>
+                <w:rFonts w:ascii="Verdana" w:hAnsi="Verdana"/>
+                <w:sz w:val="18"/>
+                <w:szCs w:val="18"/>
+              </w:rPr>
+              <w:t>{classB}</w:t>
+            </w:r>
+          </w:p>
+        </w:tc>
+        <w:tc>
+          <w:tcPr>
+            <w:tcW w:w="1010" w:type="dxa"/>
+            <w:tcBorders>
+              <w:top w:val="single" w:sz="4" w:space="0" w:color="auto"/>
+              <w:left w:val="single" w:sz="4" w:space="0" w:color="auto"/>
+              <w:bottom w:val="single" w:sz="4" w:space="0" w:color="auto"/>
+              <w:right w:val="single" w:sz="4" w:space="0" w:color="auto"/>
+            </w:tcBorders>
+            <w:shd w:val="clear" w:color="DDEBF7" w:fill="DDEBF7"/>
+            <w:noWrap/>
+            <w:vAlign w:val="center"/>
+          </w:tcPr>
+          <w:p>
+            <w:pPr>
+              <w:jc w:val="center"/>
+              <w:rPr>
+                <w:rFonts w:ascii="Verdana" w:hAnsi="Verdana" w:cs="Calibri"/>
+                <w:color w:val="000000"/>
+                <w:sz w:val="18"/>
+                <w:szCs w:val="18"/>
+              </w:rPr>
+            </w:pPr>
+            <w:r>
+              <w:rPr>
+                <w:rFonts w:ascii="Verdana" w:hAnsi="Verdana"/>
+                <w:sz w:val="18"/>
+                <w:szCs w:val="18"/>
+              </w:rPr>
+              <w:t>{classC}</w:t>
+            </w:r>
+          </w:p>
+        </w:tc>
+        <w:tc>
+          <w:tcPr>
+            <w:tcW w:w="990" w:type="dxa"/>
+            <w:tcBorders>
+              <w:top w:val="single" w:sz="4" w:space="0" w:color="auto"/>
+              <w:left w:val="single" w:sz="4" w:space="0" w:color="auto"/>
+              <w:bottom w:val="single" w:sz="4" w:space="0" w:color="auto"/>
+              <w:right w:val="single" w:sz="4" w:space="0" w:color="auto"/>
+            </w:tcBorders>
+            <w:shd w:val="clear" w:color="DDEBF7" w:fill="DDEBF7"/>
+            <w:noWrap/>
+            <w:vAlign w:val="center"/>
+          </w:tcPr>
+          <w:p>
+            <w:pPr>
+              <w:jc w:val="center"/>
+              <w:rPr>
+                <w:rFonts w:ascii="Verdana" w:hAnsi="Verdana" w:cs="Calibri"/>
+                <w:color w:val="000000"/>
+                <w:sz w:val="18"/>
+                <w:szCs w:val="18"/>
+              </w:rPr>
+            </w:pPr>
+            <w:r>
+              <w:rPr>
+                <w:rFonts w:ascii="Verdana" w:hAnsi="Verdana"/>
+                <w:sz w:val="18"/>
+                <w:szCs w:val="18"/>
+              </w:rPr>
+              <w:t>{maxV}</w:t>
+            </w:r>
+          </w:p>
+        </w:tc>
+        <w:tc>
+          <w:tcPr>
+            <w:tcW w:w="1080" w:type="dxa"/>
+            <w:tcBorders>
+              <w:top w:val="single" w:sz="4" w:space="0" w:color="auto"/>
+              <w:left w:val="single" w:sz="4" w:space="0" w:color="auto"/>
+              <w:bottom w:val="single" w:sz="4" w:space="0" w:color="auto"/>
+              <w:right w:val="single" w:sz="4" w:space="0" w:color="auto"/>
+            </w:tcBorders>
+            <w:shd w:val="clear" w:color="DDEBF7" w:fill="DDEBF7"/>
+            <w:noWrap/>
+            <w:vAlign w:val="center"/>
+          </w:tcPr>
+          <w:p>
+            <w:pPr>
+              <w:jc w:val="center"/>
+              <w:rPr>
+                <w:rFonts w:ascii="Verdana" w:hAnsi="Verdana" w:cs="Calibri"/>
+                <w:color w:val="000000"/>
+                <w:sz w:val="18"/>
+                <w:szCs w:val="18"/>
+              </w:rPr>
+            </w:pPr>
+            <w:r>
+              <w:rPr>
+                <w:rFonts w:ascii="Verdana" w:hAnsi="Verdana"/>
+                <w:sz w:val="18"/>
+                <w:szCs w:val="18"/>
+              </w:rPr>
+              <w:t>{minV}</w:t>
+            </w:r>
+          </w:p>
+        </w:tc>
+        <w:tc>
+          <w:tcPr>
+            <w:tcW w:w="1811" w:type="dxa"/>
+            <w:tcBorders>
+              <w:top w:val="single" w:sz="4" w:space="0" w:color="auto"/>
+              <w:left w:val="single" w:sz="4" w:space="0" w:color="auto"/>
+              <w:bottom w:val="single" w:sz="4" w:space="0" w:color="auto"/>
+              <w:right w:val="single" w:sz="4" w:space="0" w:color="auto"/>
+            </w:tcBorders>
+            <w:shd w:val="clear" w:color="DDEBF7" w:fill="DDEBF7"/>
+            <w:noWrap/>
+            <w:vAlign w:val="center"/>
+          </w:tcPr>
+          <w:p>
+            <w:pPr>
+              <w:jc w:val="center"/>
+              <w:rPr>
+                <w:rFonts w:ascii="Verdana" w:hAnsi="Verdana" w:cs="Calibri"/>
+                <w:color w:val="000000"/>
+                <w:sz w:val="18"/>
+                <w:szCs w:val="18"/>
+              </w:rPr>
+            </w:pPr>
+            <w:r>
+              <w:rPr>
+                <w:rStyle w:val="HTMLCode"/>
+                <w:rFonts w:ascii="Verdana" w:hAnsi="Verdana" w:cs="Times New Roman"/>
+                <w:sz w:val="18"/>
+                <w:szCs w:val="18"/>
+              </w:rPr>
+              <w:t>{remarks}</w:t>
+            </w:r>
+            <w:r>
+              <w:rPr>
+                <w:rStyle w:val="HTMLCode"/>
+                <w:rFonts w:ascii="Verdana" w:hAnsi="Verdana" w:cs="Times New Roman"/>
+                <w:sz w:val="18"/>
+                <w:szCs w:val="18"/>
+              </w:rPr>
+              <w:t xml:space="preserve"> </w:t>
+            </w:r>
+            <w:r>
+              <w:rPr>
+                <w:rStyle w:val="HTMLCode"/>
+                <w:rFonts w:ascii="Verdana" w:hAnsi="Verdana" w:cs="Times New Roman"/>
+                <w:sz w:val="18"/>
+                <w:szCs w:val="18"/>
+              </w:rPr>
+              <w:t>{/voltage</w:t>
+            </w:r>
+            <w:r>
+              <w:rPr>
+                <w:rStyle w:val="HTMLCode"/>
+                <w:rFonts w:ascii="Verdana" w:hAnsi="Verdana"/>
+                <w:sz w:val="18"/>
+                <w:szCs w:val="18"/>
+              </w:rPr>
+              <w:t>}</w:t>
+            </w:r>
+          </w:p>
+        </w:tc>
+      </w:tr>
+    </w:tbl>
     <w:p>
       <w:pPr>
         <w:rPr>
@@ -7684,7 +7711,6 @@
           <w:lang w:val="en-US" w:eastAsia="en-US" w:bidi="ne-NP"/>
         </w:rPr>
       </w:pPr>
-      <w:bookmarkStart w:id="32" w:name="_Toc62828403"/>
       <w:r>
         <w:br w:type="page"/>
       </w:r>
@@ -7949,7 +7975,7 @@
     </w:p>
     <w:tbl>
       <w:tblPr>
-        <w:tblW w:w="8917" w:type="dxa"/>
+        <w:tblW w:w="8649" w:type="dxa"/>
         <w:tblBorders>
           <w:top w:val="single" w:sz="4" w:space="0" w:color="auto"/>
           <w:left w:val="single" w:sz="4" w:space="0" w:color="auto"/>
@@ -7961,19 +7987,19 @@
         <w:tblLook w:val="04A0" w:firstRow="1" w:lastRow="0" w:firstColumn="1" w:lastColumn="0" w:noHBand="0" w:noVBand="1"/>
       </w:tblPr>
       <w:tblGrid>
-        <w:gridCol w:w="2225"/>
-        <w:gridCol w:w="1709"/>
-        <w:gridCol w:w="1709"/>
-        <w:gridCol w:w="1464"/>
-        <w:gridCol w:w="1810"/>
+        <w:gridCol w:w="2159"/>
+        <w:gridCol w:w="1657"/>
+        <w:gridCol w:w="1657"/>
+        <w:gridCol w:w="1420"/>
+        <w:gridCol w:w="1756"/>
       </w:tblGrid>
       <w:tr>
         <w:trPr>
-          <w:trHeight w:val="768"/>
+          <w:trHeight w:val="1680"/>
         </w:trPr>
         <w:tc>
           <w:tcPr>
-            <w:tcW w:w="2225" w:type="dxa"/>
+            <w:tcW w:w="2159" w:type="dxa"/>
             <w:shd w:val="clear" w:color="5B9BD5" w:fill="5B9BD5"/>
             <w:noWrap/>
             <w:vAlign w:val="center"/>
@@ -8007,7 +8033,7 @@
         </w:tc>
         <w:tc>
           <w:tcPr>
-            <w:tcW w:w="1709" w:type="dxa"/>
+            <w:tcW w:w="1657" w:type="dxa"/>
             <w:shd w:val="clear" w:color="5B9BD5" w:fill="5B9BD5"/>
             <w:vAlign w:val="center"/>
             <w:hideMark/>
@@ -8039,7 +8065,7 @@
         </w:tc>
         <w:tc>
           <w:tcPr>
-            <w:tcW w:w="1709" w:type="dxa"/>
+            <w:tcW w:w="1657" w:type="dxa"/>
             <w:shd w:val="clear" w:color="5B9BD5" w:fill="5B9BD5"/>
             <w:noWrap/>
             <w:vAlign w:val="center"/>
@@ -8072,7 +8098,7 @@
         </w:tc>
         <w:tc>
           <w:tcPr>
-            <w:tcW w:w="1464" w:type="dxa"/>
+            <w:tcW w:w="1420" w:type="dxa"/>
             <w:shd w:val="clear" w:color="5B9BD5" w:fill="5B9BD5"/>
             <w:noWrap/>
             <w:vAlign w:val="center"/>
@@ -8105,7 +8131,7 @@
         </w:tc>
         <w:tc>
           <w:tcPr>
-            <w:tcW w:w="1810" w:type="dxa"/>
+            <w:tcW w:w="1756" w:type="dxa"/>
             <w:shd w:val="clear" w:color="5B9BD5" w:fill="5B9BD5"/>
             <w:vAlign w:val="center"/>
             <w:hideMark/>
@@ -8150,11 +8176,11 @@
       </w:tr>
       <w:tr>
         <w:trPr>
-          <w:trHeight w:val="627"/>
+          <w:trHeight w:val="1373"/>
         </w:trPr>
         <w:tc>
           <w:tcPr>
-            <w:tcW w:w="2225" w:type="dxa"/>
+            <w:tcW w:w="2159" w:type="dxa"/>
             <w:shd w:val="clear" w:color="BDD7EE" w:fill="BDD7EE"/>
             <w:noWrap/>
             <w:vAlign w:val="center"/>
@@ -8165,18 +8191,23 @@
               <w:rPr>
                 <w:rFonts w:ascii="Verdana" w:hAnsi="Verdana" w:cs="Calibri"/>
                 <w:color w:val="000000"/>
-                <w:sz w:val="16"/>
-                <w:szCs w:val="16"/>
-              </w:rPr>
-            </w:pPr>
-            <w:r>
+                <w:sz w:val="18"/>
+                <w:szCs w:val="18"/>
+              </w:rPr>
+            </w:pPr>
+            <w:r>
+              <w:rPr>
+                <w:rFonts w:ascii="Verdana" w:hAnsi="Verdana"/>
+                <w:sz w:val="18"/>
+                <w:szCs w:val="18"/>
+              </w:rPr>
               <w:t>{#DSA}{iccid}</w:t>
             </w:r>
           </w:p>
         </w:tc>
         <w:tc>
           <w:tcPr>
-            <w:tcW w:w="1709" w:type="dxa"/>
+            <w:tcW w:w="1657" w:type="dxa"/>
             <w:shd w:val="clear" w:color="BDD7EE" w:fill="BDD7EE"/>
             <w:noWrap/>
             <w:vAlign w:val="center"/>
@@ -8187,26 +8218,23 @@
               <w:rPr>
                 <w:rFonts w:ascii="Verdana" w:hAnsi="Verdana" w:cs="Calibri"/>
                 <w:color w:val="000000"/>
-                <w:sz w:val="16"/>
-                <w:szCs w:val="16"/>
-              </w:rPr>
-            </w:pPr>
-            <w:r>
-              <w:t>{</w:t>
-            </w:r>
-            <w:proofErr w:type="spellStart"/>
-            <w:r>
-              <w:t>tempImsi</w:t>
-            </w:r>
-            <w:proofErr w:type="spellEnd"/>
-            <w:r>
-              <w:t>}</w:t>
-            </w:r>
-          </w:p>
-        </w:tc>
-        <w:tc>
-          <w:tcPr>
-            <w:tcW w:w="1709" w:type="dxa"/>
+                <w:sz w:val="18"/>
+                <w:szCs w:val="18"/>
+              </w:rPr>
+            </w:pPr>
+            <w:r>
+              <w:rPr>
+                <w:rFonts w:ascii="Verdana" w:hAnsi="Verdana"/>
+                <w:sz w:val="18"/>
+                <w:szCs w:val="18"/>
+              </w:rPr>
+              <w:t>{tempImsi}</w:t>
+            </w:r>
+          </w:p>
+        </w:tc>
+        <w:tc>
+          <w:tcPr>
+            <w:tcW w:w="1657" w:type="dxa"/>
             <w:shd w:val="clear" w:color="BDD7EE" w:fill="BDD7EE"/>
             <w:noWrap/>
             <w:vAlign w:val="center"/>
@@ -8217,26 +8245,23 @@
               <w:rPr>
                 <w:rFonts w:ascii="Verdana" w:hAnsi="Verdana" w:cs="Calibri"/>
                 <w:color w:val="000000"/>
-                <w:sz w:val="16"/>
-                <w:szCs w:val="16"/>
-              </w:rPr>
-            </w:pPr>
-            <w:r>
-              <w:t>{</w:t>
-            </w:r>
-            <w:proofErr w:type="spellStart"/>
-            <w:r>
-              <w:t>permImsi</w:t>
-            </w:r>
-            <w:proofErr w:type="spellEnd"/>
-            <w:r>
-              <w:t>}</w:t>
-            </w:r>
-          </w:p>
-        </w:tc>
-        <w:tc>
-          <w:tcPr>
-            <w:tcW w:w="1464" w:type="dxa"/>
+                <w:sz w:val="18"/>
+                <w:szCs w:val="18"/>
+              </w:rPr>
+            </w:pPr>
+            <w:r>
+              <w:rPr>
+                <w:rFonts w:ascii="Verdana" w:hAnsi="Verdana"/>
+                <w:sz w:val="18"/>
+                <w:szCs w:val="18"/>
+              </w:rPr>
+              <w:t>{permImsi}</w:t>
+            </w:r>
+          </w:p>
+        </w:tc>
+        <w:tc>
+          <w:tcPr>
+            <w:tcW w:w="1420" w:type="dxa"/>
             <w:shd w:val="clear" w:color="BDD7EE" w:fill="BDD7EE"/>
             <w:noWrap/>
             <w:vAlign w:val="center"/>
@@ -8247,26 +8272,23 @@
               <w:rPr>
                 <w:rFonts w:ascii="Verdana" w:hAnsi="Verdana" w:cs="Calibri"/>
                 <w:color w:val="000000"/>
-                <w:sz w:val="16"/>
-                <w:szCs w:val="16"/>
-              </w:rPr>
-            </w:pPr>
-            <w:r>
-              <w:t>{</w:t>
-            </w:r>
-            <w:proofErr w:type="spellStart"/>
-            <w:r>
-              <w:t>msisdn</w:t>
-            </w:r>
-            <w:proofErr w:type="spellEnd"/>
-            <w:r>
-              <w:t>}</w:t>
-            </w:r>
-          </w:p>
-        </w:tc>
-        <w:tc>
-          <w:tcPr>
-            <w:tcW w:w="1810" w:type="dxa"/>
+                <w:sz w:val="18"/>
+                <w:szCs w:val="18"/>
+              </w:rPr>
+            </w:pPr>
+            <w:r>
+              <w:rPr>
+                <w:rFonts w:ascii="Verdana" w:hAnsi="Verdana"/>
+                <w:sz w:val="18"/>
+                <w:szCs w:val="18"/>
+              </w:rPr>
+              <w:t>{msisdn}</w:t>
+            </w:r>
+          </w:p>
+        </w:tc>
+        <w:tc>
+          <w:tcPr>
+            <w:tcW w:w="1756" w:type="dxa"/>
             <w:shd w:val="clear" w:color="BDD7EE" w:fill="BDD7EE"/>
             <w:noWrap/>
             <w:vAlign w:val="center"/>
@@ -8277,20 +8299,17 @@
               <w:rPr>
                 <w:rFonts w:ascii="Verdana" w:hAnsi="Verdana" w:cs="Calibri"/>
                 <w:color w:val="000000"/>
-                <w:sz w:val="16"/>
-                <w:szCs w:val="16"/>
-              </w:rPr>
-            </w:pPr>
-            <w:r>
-              <w:t>{</w:t>
-            </w:r>
-            <w:proofErr w:type="spellStart"/>
-            <w:r>
-              <w:t>smsp</w:t>
-            </w:r>
-            <w:proofErr w:type="spellEnd"/>
-            <w:r>
-              <w:t>}{/DSA}</w:t>
+                <w:sz w:val="18"/>
+                <w:szCs w:val="18"/>
+              </w:rPr>
+            </w:pPr>
+            <w:r>
+              <w:rPr>
+                <w:rFonts w:ascii="Verdana" w:hAnsi="Verdana"/>
+                <w:sz w:val="18"/>
+                <w:szCs w:val="18"/>
+              </w:rPr>
+              <w:t>{smsp}{/DSA}</w:t>
             </w:r>
           </w:p>
         </w:tc>
@@ -8360,25 +8379,25 @@
     </w:p>
     <w:tbl>
       <w:tblPr>
-        <w:tblW w:w="8018" w:type="dxa"/>
+        <w:tblW w:w="8715" w:type="dxa"/>
         <w:tblLook w:val="04A0" w:firstRow="1" w:lastRow="0" w:firstColumn="1" w:lastColumn="0" w:noHBand="0" w:noVBand="1"/>
       </w:tblPr>
       <w:tblGrid>
-        <w:gridCol w:w="1449"/>
-        <w:gridCol w:w="1016"/>
-        <w:gridCol w:w="1204"/>
-        <w:gridCol w:w="1170"/>
-        <w:gridCol w:w="1213"/>
-        <w:gridCol w:w="1179"/>
-        <w:gridCol w:w="1484"/>
+        <w:gridCol w:w="1466"/>
+        <w:gridCol w:w="1024"/>
+        <w:gridCol w:w="1164"/>
+        <w:gridCol w:w="1147"/>
+        <w:gridCol w:w="1205"/>
+        <w:gridCol w:w="1187"/>
+        <w:gridCol w:w="1522"/>
       </w:tblGrid>
       <w:tr>
         <w:trPr>
-          <w:trHeight w:val="1955"/>
+          <w:trHeight w:val="687"/>
         </w:trPr>
         <w:tc>
           <w:tcPr>
-            <w:tcW w:w="1488" w:type="dxa"/>
+            <w:tcW w:w="1466" w:type="dxa"/>
             <w:tcBorders>
               <w:top w:val="single" w:sz="4" w:space="0" w:color="auto"/>
               <w:left w:val="single" w:sz="4" w:space="0" w:color="auto"/>
@@ -8417,7 +8436,7 @@
         </w:tc>
         <w:tc>
           <w:tcPr>
-            <w:tcW w:w="1020" w:type="dxa"/>
+            <w:tcW w:w="1024" w:type="dxa"/>
             <w:tcBorders>
               <w:top w:val="single" w:sz="4" w:space="0" w:color="auto"/>
               <w:left w:val="single" w:sz="4" w:space="0" w:color="auto"/>
@@ -8455,7 +8474,7 @@
         </w:tc>
         <w:tc>
           <w:tcPr>
-            <w:tcW w:w="1224" w:type="dxa"/>
+            <w:tcW w:w="1164" w:type="dxa"/>
             <w:tcBorders>
               <w:top w:val="single" w:sz="4" w:space="0" w:color="auto"/>
               <w:left w:val="single" w:sz="4" w:space="0" w:color="auto"/>
@@ -8487,7 +8506,182 @@
                 <w:sz w:val="16"/>
                 <w:szCs w:val="16"/>
               </w:rPr>
-              <w:t>Incoming Call(Y/N)</w:t>
+              <w:t>I</w:t>
+            </w:r>
+            <w:r>
+              <w:rPr>
+                <w:rFonts w:ascii="Verdana" w:hAnsi="Verdana" w:cs="Calibri"/>
+                <w:b/>
+                <w:bCs/>
+                <w:color w:val="FFFFFF"/>
+                <w:sz w:val="16"/>
+                <w:szCs w:val="16"/>
+              </w:rPr>
+              <w:t>/</w:t>
+            </w:r>
+            <w:r>
+              <w:rPr>
+                <w:rFonts w:ascii="Verdana" w:hAnsi="Verdana" w:cs="Calibri"/>
+                <w:b/>
+                <w:bCs/>
+                <w:color w:val="FFFFFF"/>
+                <w:sz w:val="16"/>
+                <w:szCs w:val="16"/>
+              </w:rPr>
+              <w:t>C</w:t>
+            </w:r>
+            <w:r>
+              <w:rPr>
+                <w:rFonts w:ascii="Verdana" w:hAnsi="Verdana" w:cs="Calibri"/>
+                <w:b/>
+                <w:bCs/>
+                <w:color w:val="FFFFFF"/>
+                <w:sz w:val="16"/>
+                <w:szCs w:val="16"/>
+              </w:rPr>
+              <w:t xml:space="preserve"> (</w:t>
+            </w:r>
+            <w:r>
+              <w:rPr>
+                <w:rFonts w:ascii="Verdana" w:hAnsi="Verdana" w:cs="Calibri"/>
+                <w:b/>
+                <w:bCs/>
+                <w:color w:val="FFFFFF"/>
+                <w:sz w:val="16"/>
+                <w:szCs w:val="16"/>
+              </w:rPr>
+              <w:t>Y/N)</w:t>
+            </w:r>
+          </w:p>
+        </w:tc>
+        <w:tc>
+          <w:tcPr>
+            <w:tcW w:w="1147" w:type="dxa"/>
+            <w:tcBorders>
+              <w:top w:val="single" w:sz="4" w:space="0" w:color="auto"/>
+              <w:left w:val="single" w:sz="4" w:space="0" w:color="auto"/>
+              <w:bottom w:val="single" w:sz="4" w:space="0" w:color="auto"/>
+              <w:right w:val="single" w:sz="4" w:space="0" w:color="auto"/>
+            </w:tcBorders>
+            <w:shd w:val="clear" w:color="5B9BD5" w:fill="5B9BD5"/>
+            <w:vAlign w:val="center"/>
+            <w:hideMark/>
+          </w:tcPr>
+          <w:p>
+            <w:pPr>
+              <w:jc w:val="center"/>
+              <w:rPr>
+                <w:rFonts w:ascii="Verdana" w:hAnsi="Verdana" w:cs="Calibri"/>
+                <w:b/>
+                <w:bCs/>
+                <w:color w:val="FFFFFF"/>
+                <w:sz w:val="16"/>
+                <w:szCs w:val="16"/>
+              </w:rPr>
+            </w:pPr>
+            <w:r>
+              <w:rPr>
+                <w:rFonts w:ascii="Verdana" w:hAnsi="Verdana" w:cs="Calibri"/>
+                <w:b/>
+                <w:bCs/>
+                <w:color w:val="FFFFFF"/>
+                <w:sz w:val="16"/>
+                <w:szCs w:val="16"/>
+              </w:rPr>
+              <w:t>O/</w:t>
+            </w:r>
+            <w:r>
+              <w:rPr>
+                <w:rFonts w:ascii="Verdana" w:hAnsi="Verdana" w:cs="Calibri"/>
+                <w:b/>
+                <w:bCs/>
+                <w:color w:val="FFFFFF"/>
+                <w:sz w:val="16"/>
+                <w:szCs w:val="16"/>
+              </w:rPr>
+              <w:t>C</w:t>
+            </w:r>
+            <w:r>
+              <w:rPr>
+                <w:rFonts w:ascii="Verdana" w:hAnsi="Verdana" w:cs="Calibri"/>
+                <w:b/>
+                <w:bCs/>
+                <w:color w:val="FFFFFF"/>
+                <w:sz w:val="16"/>
+                <w:szCs w:val="16"/>
+              </w:rPr>
+              <w:t xml:space="preserve"> (</w:t>
+            </w:r>
+            <w:r>
+              <w:rPr>
+                <w:rFonts w:ascii="Verdana" w:hAnsi="Verdana" w:cs="Calibri"/>
+                <w:b/>
+                <w:bCs/>
+                <w:color w:val="FFFFFF"/>
+                <w:sz w:val="16"/>
+                <w:szCs w:val="16"/>
+              </w:rPr>
+              <w:t>Y/N)</w:t>
+            </w:r>
+          </w:p>
+        </w:tc>
+        <w:tc>
+          <w:tcPr>
+            <w:tcW w:w="1205" w:type="dxa"/>
+            <w:tcBorders>
+              <w:top w:val="single" w:sz="4" w:space="0" w:color="auto"/>
+              <w:left w:val="single" w:sz="4" w:space="0" w:color="auto"/>
+              <w:bottom w:val="single" w:sz="4" w:space="0" w:color="auto"/>
+              <w:right w:val="single" w:sz="4" w:space="0" w:color="auto"/>
+            </w:tcBorders>
+            <w:shd w:val="clear" w:color="5B9BD5" w:fill="5B9BD5"/>
+            <w:vAlign w:val="center"/>
+            <w:hideMark/>
+          </w:tcPr>
+          <w:p>
+            <w:pPr>
+              <w:jc w:val="center"/>
+              <w:rPr>
+                <w:rFonts w:ascii="Verdana" w:hAnsi="Verdana" w:cs="Calibri"/>
+                <w:b/>
+                <w:bCs/>
+                <w:color w:val="FFFFFF"/>
+                <w:sz w:val="16"/>
+                <w:szCs w:val="16"/>
+              </w:rPr>
+            </w:pPr>
+            <w:r>
+              <w:rPr>
+                <w:rFonts w:ascii="Verdana" w:hAnsi="Verdana" w:cs="Calibri"/>
+                <w:b/>
+                <w:bCs/>
+                <w:color w:val="FFFFFF"/>
+                <w:sz w:val="16"/>
+                <w:szCs w:val="16"/>
+              </w:rPr>
+              <w:t>I</w:t>
+            </w:r>
+            <w:r>
+              <w:rPr>
+                <w:rFonts w:ascii="Verdana" w:hAnsi="Verdana" w:cs="Calibri"/>
+                <w:b/>
+                <w:bCs/>
+                <w:color w:val="FFFFFF"/>
+                <w:sz w:val="16"/>
+                <w:szCs w:val="16"/>
+              </w:rPr>
+              <w:t>/C</w:t>
+            </w:r>
+            <w:r>
+              <w:rPr>
+                <w:rFonts w:ascii="Verdana" w:hAnsi="Verdana" w:cs="Calibri"/>
+                <w:b/>
+                <w:bCs/>
+                <w:color w:val="FFFFFF"/>
+                <w:sz w:val="16"/>
+                <w:szCs w:val="16"/>
+              </w:rPr>
+              <w:t xml:space="preserve"> SMS(Y/N)</w:t>
             </w:r>
           </w:p>
         </w:tc>
@@ -8516,7 +8710,6 @@
                 <w:szCs w:val="16"/>
               </w:rPr>
             </w:pPr>
-            <w:proofErr w:type="spellStart"/>
             <w:r>
               <w:rPr>
                 <w:rFonts w:ascii="Verdana" w:hAnsi="Verdana" w:cs="Calibri"/>
@@ -8526,9 +8719,8 @@
                 <w:sz w:val="16"/>
                 <w:szCs w:val="16"/>
               </w:rPr>
-              <w:t>Outgonig</w:t>
-            </w:r>
-            <w:proofErr w:type="spellEnd"/>
+              <w:t>O</w:t>
+            </w:r>
             <w:r>
               <w:rPr>
                 <w:rFonts w:ascii="Verdana" w:hAnsi="Verdana" w:cs="Calibri"/>
@@ -8538,13 +8730,24 @@
                 <w:sz w:val="16"/>
                 <w:szCs w:val="16"/>
               </w:rPr>
-              <w:t xml:space="preserve"> Call(Y/N)</w:t>
-            </w:r>
-          </w:p>
-        </w:tc>
-        <w:tc>
-          <w:tcPr>
-            <w:tcW w:w="1234" w:type="dxa"/>
+              <w:t>/G S</w:t>
+            </w:r>
+            <w:r>
+              <w:rPr>
+                <w:rFonts w:ascii="Verdana" w:hAnsi="Verdana" w:cs="Calibri"/>
+                <w:b/>
+                <w:bCs/>
+                <w:color w:val="FFFFFF"/>
+                <w:sz w:val="16"/>
+                <w:szCs w:val="16"/>
+              </w:rPr>
+              <w:t>MS(Y/N)</w:t>
+            </w:r>
+          </w:p>
+        </w:tc>
+        <w:tc>
+          <w:tcPr>
+            <w:tcW w:w="1522" w:type="dxa"/>
             <w:tcBorders>
               <w:top w:val="single" w:sz="4" w:space="0" w:color="auto"/>
               <w:left w:val="single" w:sz="4" w:space="0" w:color="auto"/>
@@ -8576,95 +8779,6 @@
                 <w:sz w:val="16"/>
                 <w:szCs w:val="16"/>
               </w:rPr>
-              <w:t>Incoming SMS(Y/N)</w:t>
-            </w:r>
-          </w:p>
-        </w:tc>
-        <w:tc>
-          <w:tcPr>
-            <w:tcW w:w="1197" w:type="dxa"/>
-            <w:tcBorders>
-              <w:top w:val="single" w:sz="4" w:space="0" w:color="auto"/>
-              <w:left w:val="single" w:sz="4" w:space="0" w:color="auto"/>
-              <w:bottom w:val="single" w:sz="4" w:space="0" w:color="auto"/>
-              <w:right w:val="single" w:sz="4" w:space="0" w:color="auto"/>
-            </w:tcBorders>
-            <w:shd w:val="clear" w:color="5B9BD5" w:fill="5B9BD5"/>
-            <w:vAlign w:val="center"/>
-            <w:hideMark/>
-          </w:tcPr>
-          <w:p>
-            <w:pPr>
-              <w:jc w:val="center"/>
-              <w:rPr>
-                <w:rFonts w:ascii="Verdana" w:hAnsi="Verdana" w:cs="Calibri"/>
-                <w:b/>
-                <w:bCs/>
-                <w:color w:val="FFFFFF"/>
-                <w:sz w:val="16"/>
-                <w:szCs w:val="16"/>
-              </w:rPr>
-            </w:pPr>
-            <w:proofErr w:type="spellStart"/>
-            <w:r>
-              <w:rPr>
-                <w:rFonts w:ascii="Verdana" w:hAnsi="Verdana" w:cs="Calibri"/>
-                <w:b/>
-                <w:bCs/>
-                <w:color w:val="FFFFFF"/>
-                <w:sz w:val="16"/>
-                <w:szCs w:val="16"/>
-              </w:rPr>
-              <w:t>Outgonig</w:t>
-            </w:r>
-            <w:proofErr w:type="spellEnd"/>
-            <w:r>
-              <w:rPr>
-                <w:rFonts w:ascii="Verdana" w:hAnsi="Verdana" w:cs="Calibri"/>
-                <w:b/>
-                <w:bCs/>
-                <w:color w:val="FFFFFF"/>
-                <w:sz w:val="16"/>
-                <w:szCs w:val="16"/>
-              </w:rPr>
-              <w:t xml:space="preserve"> SMS(Y/N)</w:t>
-            </w:r>
-          </w:p>
-        </w:tc>
-        <w:tc>
-          <w:tcPr>
-            <w:tcW w:w="668" w:type="dxa"/>
-            <w:tcBorders>
-              <w:top w:val="single" w:sz="4" w:space="0" w:color="auto"/>
-              <w:left w:val="single" w:sz="4" w:space="0" w:color="auto"/>
-              <w:bottom w:val="single" w:sz="4" w:space="0" w:color="auto"/>
-              <w:right w:val="single" w:sz="4" w:space="0" w:color="auto"/>
-            </w:tcBorders>
-            <w:shd w:val="clear" w:color="5B9BD5" w:fill="5B9BD5"/>
-            <w:vAlign w:val="center"/>
-            <w:hideMark/>
-          </w:tcPr>
-          <w:p>
-            <w:pPr>
-              <w:jc w:val="center"/>
-              <w:rPr>
-                <w:rFonts w:ascii="Verdana" w:hAnsi="Verdana" w:cs="Calibri"/>
-                <w:b/>
-                <w:bCs/>
-                <w:color w:val="FFFFFF"/>
-                <w:sz w:val="16"/>
-                <w:szCs w:val="16"/>
-              </w:rPr>
-            </w:pPr>
-            <w:r>
-              <w:rPr>
-                <w:rFonts w:ascii="Verdana" w:hAnsi="Verdana" w:cs="Calibri"/>
-                <w:b/>
-                <w:bCs/>
-                <w:color w:val="FFFFFF"/>
-                <w:sz w:val="16"/>
-                <w:szCs w:val="16"/>
-              </w:rPr>
               <w:t>Handset</w:t>
             </w:r>
           </w:p>
@@ -8672,11 +8786,11 @@
       </w:tr>
       <w:tr>
         <w:trPr>
-          <w:trHeight w:val="1597"/>
+          <w:trHeight w:val="1119"/>
         </w:trPr>
         <w:tc>
           <w:tcPr>
-            <w:tcW w:w="1488" w:type="dxa"/>
+            <w:tcW w:w="1466" w:type="dxa"/>
             <w:tcBorders>
               <w:top w:val="single" w:sz="4" w:space="0" w:color="auto"/>
               <w:left w:val="single" w:sz="4" w:space="0" w:color="auto"/>
@@ -8693,18 +8807,23 @@
               <w:rPr>
                 <w:rFonts w:ascii="Verdana" w:hAnsi="Verdana" w:cs="Calibri"/>
                 <w:color w:val="000000"/>
-                <w:sz w:val="16"/>
-                <w:szCs w:val="16"/>
-              </w:rPr>
-            </w:pPr>
-            <w:r>
+                <w:sz w:val="18"/>
+                <w:szCs w:val="18"/>
+              </w:rPr>
+            </w:pPr>
+            <w:r>
+              <w:rPr>
+                <w:rFonts w:ascii="Verdana" w:hAnsi="Verdana"/>
+                <w:sz w:val="18"/>
+                <w:szCs w:val="18"/>
+              </w:rPr>
               <w:t>{#Online}{msisdn}</w:t>
             </w:r>
           </w:p>
         </w:tc>
         <w:tc>
           <w:tcPr>
-            <w:tcW w:w="1020" w:type="dxa"/>
+            <w:tcW w:w="1024" w:type="dxa"/>
             <w:tcBorders>
               <w:top w:val="single" w:sz="4" w:space="0" w:color="auto"/>
               <w:left w:val="single" w:sz="4" w:space="0" w:color="auto"/>
@@ -8721,26 +8840,23 @@
               <w:rPr>
                 <w:rFonts w:ascii="Verdana" w:hAnsi="Verdana" w:cs="Calibri"/>
                 <w:color w:val="000000"/>
-                <w:sz w:val="16"/>
-                <w:szCs w:val="16"/>
-              </w:rPr>
-            </w:pPr>
-            <w:r>
-              <w:t>{</w:t>
-            </w:r>
-            <w:proofErr w:type="spellStart"/>
-            <w:r>
-              <w:t>dataCheck</w:t>
-            </w:r>
-            <w:proofErr w:type="spellEnd"/>
-            <w:r>
-              <w:t>}</w:t>
-            </w:r>
-          </w:p>
-        </w:tc>
-        <w:tc>
-          <w:tcPr>
-            <w:tcW w:w="1224" w:type="dxa"/>
+                <w:sz w:val="18"/>
+                <w:szCs w:val="18"/>
+              </w:rPr>
+            </w:pPr>
+            <w:r>
+              <w:rPr>
+                <w:rFonts w:ascii="Verdana" w:hAnsi="Verdana"/>
+                <w:sz w:val="18"/>
+                <w:szCs w:val="18"/>
+              </w:rPr>
+              <w:t>{dataCheck}</w:t>
+            </w:r>
+          </w:p>
+        </w:tc>
+        <w:tc>
+          <w:tcPr>
+            <w:tcW w:w="1164" w:type="dxa"/>
             <w:tcBorders>
               <w:top w:val="single" w:sz="4" w:space="0" w:color="auto"/>
               <w:left w:val="single" w:sz="4" w:space="0" w:color="auto"/>
@@ -8757,20 +8873,83 @@
               <w:rPr>
                 <w:rFonts w:ascii="Verdana" w:hAnsi="Verdana" w:cs="Calibri"/>
                 <w:color w:val="000000"/>
-                <w:sz w:val="16"/>
-                <w:szCs w:val="16"/>
-              </w:rPr>
-            </w:pPr>
-            <w:r>
-              <w:t>{</w:t>
-            </w:r>
-            <w:proofErr w:type="spellStart"/>
-            <w:r>
-              <w:t>incomingCall</w:t>
-            </w:r>
-            <w:proofErr w:type="spellEnd"/>
-            <w:r>
-              <w:t>}</w:t>
+                <w:sz w:val="18"/>
+                <w:szCs w:val="18"/>
+              </w:rPr>
+            </w:pPr>
+            <w:r>
+              <w:rPr>
+                <w:rFonts w:ascii="Verdana" w:hAnsi="Verdana"/>
+                <w:sz w:val="18"/>
+                <w:szCs w:val="18"/>
+              </w:rPr>
+              <w:t>{incomingCall}</w:t>
+            </w:r>
+          </w:p>
+        </w:tc>
+        <w:tc>
+          <w:tcPr>
+            <w:tcW w:w="1147" w:type="dxa"/>
+            <w:tcBorders>
+              <w:top w:val="single" w:sz="4" w:space="0" w:color="auto"/>
+              <w:left w:val="single" w:sz="4" w:space="0" w:color="auto"/>
+              <w:bottom w:val="single" w:sz="4" w:space="0" w:color="auto"/>
+              <w:right w:val="single" w:sz="4" w:space="0" w:color="auto"/>
+            </w:tcBorders>
+            <w:shd w:val="clear" w:color="BDD7EE" w:fill="BDD7EE"/>
+            <w:noWrap/>
+            <w:vAlign w:val="center"/>
+          </w:tcPr>
+          <w:p>
+            <w:pPr>
+              <w:jc w:val="center"/>
+              <w:rPr>
+                <w:rFonts w:ascii="Verdana" w:hAnsi="Verdana" w:cs="Calibri"/>
+                <w:color w:val="000000"/>
+                <w:sz w:val="18"/>
+                <w:szCs w:val="18"/>
+              </w:rPr>
+            </w:pPr>
+            <w:r>
+              <w:rPr>
+                <w:rFonts w:ascii="Verdana" w:hAnsi="Verdana"/>
+                <w:sz w:val="18"/>
+                <w:szCs w:val="18"/>
+              </w:rPr>
+              <w:t>{outgoingCall}</w:t>
+            </w:r>
+          </w:p>
+        </w:tc>
+        <w:tc>
+          <w:tcPr>
+            <w:tcW w:w="1205" w:type="dxa"/>
+            <w:tcBorders>
+              <w:top w:val="single" w:sz="4" w:space="0" w:color="auto"/>
+              <w:left w:val="single" w:sz="4" w:space="0" w:color="auto"/>
+              <w:bottom w:val="single" w:sz="4" w:space="0" w:color="auto"/>
+              <w:right w:val="single" w:sz="4" w:space="0" w:color="auto"/>
+            </w:tcBorders>
+            <w:shd w:val="clear" w:color="BDD7EE" w:fill="BDD7EE"/>
+            <w:noWrap/>
+            <w:vAlign w:val="center"/>
+          </w:tcPr>
+          <w:p>
+            <w:pPr>
+              <w:jc w:val="center"/>
+              <w:rPr>
+                <w:rFonts w:ascii="Verdana" w:hAnsi="Verdana" w:cs="Calibri"/>
+                <w:color w:val="000000"/>
+                <w:sz w:val="18"/>
+                <w:szCs w:val="18"/>
+              </w:rPr>
+            </w:pPr>
+            <w:r>
+              <w:rPr>
+                <w:rFonts w:ascii="Verdana" w:hAnsi="Verdana"/>
+                <w:sz w:val="18"/>
+                <w:szCs w:val="18"/>
+              </w:rPr>
+              <w:t>{incomingSms}</w:t>
             </w:r>
           </w:p>
         </w:tc>
@@ -8793,26 +8972,23 @@
               <w:rPr>
                 <w:rFonts w:ascii="Verdana" w:hAnsi="Verdana" w:cs="Calibri"/>
                 <w:color w:val="000000"/>
-                <w:sz w:val="16"/>
-                <w:szCs w:val="16"/>
-              </w:rPr>
-            </w:pPr>
-            <w:r>
-              <w:t>{</w:t>
-            </w:r>
-            <w:proofErr w:type="spellStart"/>
-            <w:r>
-              <w:t>outgoingCall</w:t>
-            </w:r>
-            <w:proofErr w:type="spellEnd"/>
-            <w:r>
-              <w:t>}</w:t>
-            </w:r>
-          </w:p>
-        </w:tc>
-        <w:tc>
-          <w:tcPr>
-            <w:tcW w:w="1234" w:type="dxa"/>
+                <w:sz w:val="18"/>
+                <w:szCs w:val="18"/>
+              </w:rPr>
+            </w:pPr>
+            <w:r>
+              <w:rPr>
+                <w:rFonts w:ascii="Verdana" w:hAnsi="Verdana"/>
+                <w:sz w:val="18"/>
+                <w:szCs w:val="18"/>
+              </w:rPr>
+              <w:t>{outgoingSms}</w:t>
+            </w:r>
+          </w:p>
+        </w:tc>
+        <w:tc>
+          <w:tcPr>
+            <w:tcW w:w="1522" w:type="dxa"/>
             <w:tcBorders>
               <w:top w:val="single" w:sz="4" w:space="0" w:color="auto"/>
               <w:left w:val="single" w:sz="4" w:space="0" w:color="auto"/>
@@ -8822,6 +8998,7 @@
             <w:shd w:val="clear" w:color="BDD7EE" w:fill="BDD7EE"/>
             <w:noWrap/>
             <w:vAlign w:val="center"/>
+            <w:hideMark/>
           </w:tcPr>
           <w:p>
             <w:pPr>
@@ -8829,93 +9006,25 @@
               <w:rPr>
                 <w:rFonts w:ascii="Verdana" w:hAnsi="Verdana" w:cs="Calibri"/>
                 <w:color w:val="000000"/>
-                <w:sz w:val="16"/>
-                <w:szCs w:val="16"/>
-              </w:rPr>
-            </w:pPr>
-            <w:r>
-              <w:t>{</w:t>
-            </w:r>
-            <w:proofErr w:type="spellStart"/>
-            <w:r>
-              <w:t>incomingSms</w:t>
-            </w:r>
-            <w:proofErr w:type="spellEnd"/>
-            <w:r>
-              <w:t>}</w:t>
-            </w:r>
-          </w:p>
-        </w:tc>
-        <w:tc>
-          <w:tcPr>
-            <w:tcW w:w="1197" w:type="dxa"/>
-            <w:tcBorders>
-              <w:top w:val="single" w:sz="4" w:space="0" w:color="auto"/>
-              <w:left w:val="single" w:sz="4" w:space="0" w:color="auto"/>
-              <w:bottom w:val="single" w:sz="4" w:space="0" w:color="auto"/>
-              <w:right w:val="single" w:sz="4" w:space="0" w:color="auto"/>
-            </w:tcBorders>
-            <w:shd w:val="clear" w:color="BDD7EE" w:fill="BDD7EE"/>
-            <w:noWrap/>
-            <w:vAlign w:val="center"/>
-          </w:tcPr>
-          <w:p>
-            <w:pPr>
-              <w:jc w:val="center"/>
-              <w:rPr>
-                <w:rFonts w:ascii="Verdana" w:hAnsi="Verdana" w:cs="Calibri"/>
-                <w:color w:val="000000"/>
-                <w:sz w:val="16"/>
-                <w:szCs w:val="16"/>
-              </w:rPr>
-            </w:pPr>
-            <w:r>
-              <w:t>{</w:t>
-            </w:r>
-            <w:proofErr w:type="spellStart"/>
-            <w:r>
-              <w:t>outgoingSms</w:t>
-            </w:r>
-            <w:proofErr w:type="spellEnd"/>
-            <w:r>
-              <w:t>}</w:t>
-            </w:r>
-          </w:p>
-        </w:tc>
-        <w:tc>
-          <w:tcPr>
-            <w:tcW w:w="668" w:type="dxa"/>
-            <w:tcBorders>
-              <w:top w:val="single" w:sz="4" w:space="0" w:color="auto"/>
-              <w:left w:val="single" w:sz="4" w:space="0" w:color="auto"/>
-              <w:bottom w:val="single" w:sz="4" w:space="0" w:color="auto"/>
-              <w:right w:val="single" w:sz="4" w:space="0" w:color="auto"/>
-            </w:tcBorders>
-            <w:shd w:val="clear" w:color="BDD7EE" w:fill="BDD7EE"/>
-            <w:noWrap/>
-            <w:vAlign w:val="center"/>
-            <w:hideMark/>
-          </w:tcPr>
-          <w:p>
-            <w:pPr>
-              <w:jc w:val="center"/>
-              <w:rPr>
-                <w:rFonts w:ascii="Verdana" w:hAnsi="Verdana" w:cs="Calibri"/>
-                <w:color w:val="000000"/>
-                <w:sz w:val="16"/>
-                <w:szCs w:val="16"/>
-              </w:rPr>
-            </w:pPr>
-            <w:r>
-              <w:rPr>
-                <w:rFonts w:ascii="Verdana" w:hAnsi="Verdana" w:cs="Calibri"/>
-                <w:color w:val="000000"/>
-                <w:sz w:val="16"/>
-                <w:szCs w:val="16"/>
+                <w:sz w:val="18"/>
+                <w:szCs w:val="18"/>
+              </w:rPr>
+            </w:pPr>
+            <w:r>
+              <w:rPr>
+                <w:rFonts w:ascii="Verdana" w:hAnsi="Verdana" w:cs="Calibri"/>
+                <w:color w:val="000000"/>
+                <w:sz w:val="18"/>
+                <w:szCs w:val="18"/>
               </w:rPr>
               <w:t> </w:t>
             </w:r>
             <w:r>
+              <w:rPr>
+                <w:rFonts w:ascii="Verdana" w:hAnsi="Verdana"/>
+                <w:sz w:val="18"/>
+                <w:szCs w:val="18"/>
+              </w:rPr>
               <w:t>{handset}{/Online}</w:t>
             </w:r>
           </w:p>
@@ -8999,12 +9108,12 @@
         <w:tblLook w:val="04A0" w:firstRow="1" w:lastRow="0" w:firstColumn="1" w:lastColumn="0" w:noHBand="0" w:noVBand="1"/>
       </w:tblPr>
       <w:tblGrid>
-        <w:gridCol w:w="1703"/>
-        <w:gridCol w:w="1447"/>
-        <w:gridCol w:w="1340"/>
-        <w:gridCol w:w="1600"/>
-        <w:gridCol w:w="980"/>
-        <w:gridCol w:w="1917"/>
+        <w:gridCol w:w="1732"/>
+        <w:gridCol w:w="1411"/>
+        <w:gridCol w:w="1294"/>
+        <w:gridCol w:w="1710"/>
+        <w:gridCol w:w="957"/>
+        <w:gridCol w:w="1883"/>
       </w:tblGrid>
       <w:tr>
         <w:trPr>
@@ -9220,11 +9329,16 @@
               <w:rPr>
                 <w:rFonts w:ascii="Verdana" w:hAnsi="Verdana" w:cs="Calibri"/>
                 <w:color w:val="000000"/>
-                <w:sz w:val="16"/>
-                <w:szCs w:val="16"/>
-              </w:rPr>
-            </w:pPr>
-            <w:r>
+                <w:sz w:val="18"/>
+                <w:szCs w:val="18"/>
+              </w:rPr>
+            </w:pPr>
+            <w:r>
+              <w:rPr>
+                <w:rFonts w:ascii="Verdana" w:hAnsi="Verdana"/>
+                <w:sz w:val="18"/>
+                <w:szCs w:val="18"/>
+              </w:rPr>
               <w:t>{#dstk}{iccid}</w:t>
             </w:r>
           </w:p>
@@ -9241,20 +9355,17 @@
               <w:rPr>
                 <w:rFonts w:ascii="Verdana" w:hAnsi="Verdana" w:cs="Calibri"/>
                 <w:color w:val="000000"/>
-                <w:sz w:val="16"/>
-                <w:szCs w:val="16"/>
-              </w:rPr>
-            </w:pPr>
-            <w:r>
-              <w:t>{</w:t>
-            </w:r>
-            <w:proofErr w:type="spellStart"/>
-            <w:r>
-              <w:t>testCaseId</w:t>
-            </w:r>
-            <w:proofErr w:type="spellEnd"/>
-            <w:r>
-              <w:t>}</w:t>
+                <w:sz w:val="18"/>
+                <w:szCs w:val="18"/>
+              </w:rPr>
+            </w:pPr>
+            <w:r>
+              <w:rPr>
+                <w:rFonts w:ascii="Verdana" w:hAnsi="Verdana"/>
+                <w:sz w:val="18"/>
+                <w:szCs w:val="18"/>
+              </w:rPr>
+              <w:t>{testCaseId}</w:t>
             </w:r>
           </w:p>
         </w:tc>
@@ -9269,11 +9380,16 @@
               <w:rPr>
                 <w:rFonts w:ascii="Verdana" w:hAnsi="Verdana" w:cs="Calibri"/>
                 <w:color w:val="000000"/>
-                <w:sz w:val="16"/>
-                <w:szCs w:val="16"/>
-              </w:rPr>
-            </w:pPr>
-            <w:r>
+                <w:sz w:val="18"/>
+                <w:szCs w:val="18"/>
+              </w:rPr>
+            </w:pPr>
+            <w:r>
+              <w:rPr>
+                <w:rFonts w:ascii="Verdana" w:hAnsi="Verdana"/>
+                <w:sz w:val="18"/>
+                <w:szCs w:val="18"/>
+              </w:rPr>
               <w:t>{summary}</w:t>
             </w:r>
           </w:p>
@@ -9289,11 +9405,16 @@
               <w:rPr>
                 <w:rFonts w:ascii="Verdana" w:hAnsi="Verdana" w:cs="Calibri"/>
                 <w:color w:val="000000"/>
-                <w:sz w:val="16"/>
-                <w:szCs w:val="16"/>
-              </w:rPr>
-            </w:pPr>
-            <w:r>
+                <w:sz w:val="18"/>
+                <w:szCs w:val="18"/>
+              </w:rPr>
+            </w:pPr>
+            <w:r>
+              <w:rPr>
+                <w:rFonts w:ascii="Verdana" w:hAnsi="Verdana"/>
+                <w:sz w:val="18"/>
+                <w:szCs w:val="18"/>
+              </w:rPr>
               <w:t>{description}</w:t>
             </w:r>
           </w:p>
@@ -9310,11 +9431,16 @@
               <w:rPr>
                 <w:rFonts w:ascii="Verdana" w:hAnsi="Verdana" w:cs="Calibri"/>
                 <w:color w:val="000000"/>
-                <w:sz w:val="16"/>
-                <w:szCs w:val="16"/>
-              </w:rPr>
-            </w:pPr>
-            <w:r>
+                <w:sz w:val="18"/>
+                <w:szCs w:val="18"/>
+              </w:rPr>
+            </w:pPr>
+            <w:r>
+              <w:rPr>
+                <w:rFonts w:ascii="Verdana" w:hAnsi="Verdana"/>
+                <w:sz w:val="18"/>
+                <w:szCs w:val="18"/>
+              </w:rPr>
               <w:t>{result}</w:t>
             </w:r>
           </w:p>
@@ -9331,20 +9457,17 @@
               <w:rPr>
                 <w:rFonts w:ascii="Verdana" w:hAnsi="Verdana" w:cs="Calibri"/>
                 <w:color w:val="000000"/>
-                <w:sz w:val="16"/>
-                <w:szCs w:val="16"/>
-              </w:rPr>
-            </w:pPr>
-            <w:r>
-              <w:t>{remarks}{/</w:t>
-            </w:r>
-            <w:proofErr w:type="spellStart"/>
-            <w:r>
-              <w:t>dstk</w:t>
-            </w:r>
-            <w:proofErr w:type="spellEnd"/>
-            <w:r>
-              <w:t>}</w:t>
+                <w:sz w:val="18"/>
+                <w:szCs w:val="18"/>
+              </w:rPr>
+            </w:pPr>
+            <w:r>
+              <w:rPr>
+                <w:rFonts w:ascii="Verdana" w:hAnsi="Verdana"/>
+                <w:sz w:val="18"/>
+                <w:szCs w:val="18"/>
+              </w:rPr>
+              <w:t>{remarks}{/dstk}</w:t>
             </w:r>
           </w:p>
         </w:tc>
@@ -9425,27 +9548,27 @@
     </w:p>
     <w:tbl>
       <w:tblPr>
-        <w:tblW w:w="8694" w:type="dxa"/>
+        <w:tblW w:w="8715" w:type="dxa"/>
         <w:tblLook w:val="04A0" w:firstRow="1" w:lastRow="0" w:firstColumn="1" w:lastColumn="0" w:noHBand="0" w:noVBand="1"/>
       </w:tblPr>
       <w:tblGrid>
-        <w:gridCol w:w="4401"/>
-        <w:gridCol w:w="4293"/>
+        <w:gridCol w:w="3595"/>
+        <w:gridCol w:w="5120"/>
       </w:tblGrid>
       <w:tr>
         <w:trPr>
-          <w:trHeight w:val="389"/>
+          <w:trHeight w:val="726"/>
         </w:trPr>
         <w:tc>
           <w:tcPr>
-            <w:tcW w:w="4401" w:type="dxa"/>
+            <w:tcW w:w="3595" w:type="dxa"/>
             <w:tcBorders>
               <w:top w:val="single" w:sz="4" w:space="0" w:color="auto"/>
               <w:left w:val="single" w:sz="4" w:space="0" w:color="auto"/>
               <w:bottom w:val="single" w:sz="4" w:space="0" w:color="auto"/>
               <w:right w:val="single" w:sz="4" w:space="0" w:color="auto"/>
             </w:tcBorders>
-            <w:shd w:val="clear" w:color="5B9BD5" w:fill="5B9BD5"/>
+            <w:shd w:val="clear" w:color="auto" w:fill="5B9BD5"/>
             <w:noWrap/>
             <w:vAlign w:val="center"/>
             <w:hideMark/>
@@ -9458,19 +9581,22 @@
                 <w:b/>
                 <w:bCs/>
                 <w:color w:val="FFFFFF"/>
-                <w:sz w:val="16"/>
-                <w:szCs w:val="16"/>
-                <w:lang w:val="en-IN" w:eastAsia="en-IN"/>
-              </w:rPr>
-            </w:pPr>
+                <w:sz w:val="18"/>
+                <w:szCs w:val="18"/>
+                <w:lang w:val="en-US" w:eastAsia="en-US"/>
+              </w:rPr>
+            </w:pPr>
+            <w:bookmarkStart w:id="55" w:name="_Toc66197316"/>
+            <w:bookmarkStart w:id="56" w:name="_Toc171507084"/>
+            <w:bookmarkStart w:id="57" w:name="_Toc62828420"/>
             <w:r>
               <w:rPr>
                 <w:rFonts w:ascii="Verdana" w:hAnsi="Verdana" w:cs="Calibri"/>
                 <w:b/>
                 <w:bCs/>
                 <w:color w:val="FFFFFF"/>
-                <w:sz w:val="16"/>
-                <w:szCs w:val="16"/>
+                <w:sz w:val="18"/>
+                <w:szCs w:val="18"/>
               </w:rPr>
               <w:t>Updated files via OTA</w:t>
             </w:r>
@@ -9478,14 +9604,14 @@
         </w:tc>
         <w:tc>
           <w:tcPr>
-            <w:tcW w:w="4293" w:type="dxa"/>
+            <w:tcW w:w="5120" w:type="dxa"/>
             <w:tcBorders>
               <w:top w:val="single" w:sz="4" w:space="0" w:color="auto"/>
               <w:left w:val="single" w:sz="4" w:space="0" w:color="auto"/>
               <w:bottom w:val="single" w:sz="4" w:space="0" w:color="auto"/>
               <w:right w:val="single" w:sz="4" w:space="0" w:color="auto"/>
             </w:tcBorders>
-            <w:shd w:val="clear" w:color="5B9BD5" w:fill="5B9BD5"/>
+            <w:shd w:val="clear" w:color="auto" w:fill="5B9BD5"/>
             <w:noWrap/>
             <w:vAlign w:val="center"/>
             <w:hideMark/>
@@ -9498,8 +9624,8 @@
                 <w:b/>
                 <w:bCs/>
                 <w:color w:val="FFFFFF"/>
-                <w:sz w:val="16"/>
-                <w:szCs w:val="16"/>
+                <w:sz w:val="18"/>
+                <w:szCs w:val="18"/>
               </w:rPr>
             </w:pPr>
             <w:r>
@@ -9508,8 +9634,8 @@
                 <w:b/>
                 <w:bCs/>
                 <w:color w:val="FFFFFF"/>
-                <w:sz w:val="16"/>
-                <w:szCs w:val="16"/>
+                <w:sz w:val="18"/>
+                <w:szCs w:val="18"/>
               </w:rPr>
               <w:t>Remarks</w:t>
             </w:r>
@@ -9518,66 +9644,72 @@
       </w:tr>
       <w:tr>
         <w:trPr>
-          <w:trHeight w:val="205"/>
+          <w:trHeight w:val="457"/>
         </w:trPr>
         <w:tc>
           <w:tcPr>
-            <w:tcW w:w="4401" w:type="dxa"/>
+            <w:tcW w:w="3595" w:type="dxa"/>
             <w:tcBorders>
               <w:top w:val="single" w:sz="4" w:space="0" w:color="auto"/>
               <w:left w:val="single" w:sz="4" w:space="0" w:color="auto"/>
               <w:bottom w:val="single" w:sz="4" w:space="0" w:color="auto"/>
               <w:right w:val="single" w:sz="4" w:space="0" w:color="auto"/>
             </w:tcBorders>
-            <w:shd w:val="clear" w:color="BDD7EE" w:fill="BDD7EE"/>
-            <w:vAlign w:val="center"/>
-          </w:tcPr>
-          <w:p>
-            <w:pPr>
-              <w:rPr>
-                <w:rFonts w:ascii="Verdana" w:hAnsi="Verdana" w:cs="Calibri"/>
-                <w:color w:val="000000"/>
-                <w:sz w:val="16"/>
-                <w:szCs w:val="16"/>
-              </w:rPr>
-            </w:pPr>
-            <w:r>
-              <w:t>{#otaLogs}{log}</w:t>
-            </w:r>
-          </w:p>
-        </w:tc>
-        <w:tc>
-          <w:tcPr>
-            <w:tcW w:w="4293" w:type="dxa"/>
+            <w:shd w:val="clear" w:color="auto" w:fill="DDEBF7"/>
+            <w:noWrap/>
+            <w:vAlign w:val="center"/>
+          </w:tcPr>
+          <w:p>
+            <w:pPr>
+              <w:rPr>
+                <w:rFonts w:ascii="Verdana" w:hAnsi="Verdana" w:cs="Calibri"/>
+                <w:color w:val="000000"/>
+                <w:sz w:val="18"/>
+                <w:szCs w:val="18"/>
+              </w:rPr>
+            </w:pPr>
+            <w:r>
+              <w:rPr>
+                <w:rFonts w:ascii="Verdana" w:hAnsi="Verdana" w:cs="Calibri"/>
+                <w:color w:val="000000"/>
+                <w:sz w:val="18"/>
+                <w:szCs w:val="18"/>
+              </w:rPr>
+              <w:t>{#ota}{log}</w:t>
+            </w:r>
+          </w:p>
+        </w:tc>
+        <w:tc>
+          <w:tcPr>
+            <w:tcW w:w="5120" w:type="dxa"/>
             <w:tcBorders>
               <w:top w:val="single" w:sz="4" w:space="0" w:color="auto"/>
               <w:left w:val="single" w:sz="4" w:space="0" w:color="auto"/>
               <w:bottom w:val="single" w:sz="4" w:space="0" w:color="auto"/>
               <w:right w:val="single" w:sz="4" w:space="0" w:color="auto"/>
             </w:tcBorders>
-            <w:shd w:val="clear" w:color="BDD7EE" w:fill="BDD7EE"/>
+            <w:shd w:val="clear" w:color="auto" w:fill="DDEBF7"/>
             <w:noWrap/>
             <w:vAlign w:val="center"/>
           </w:tcPr>
           <w:p>
             <w:pPr>
-              <w:rPr>
-                <w:rFonts w:ascii="Verdana" w:hAnsi="Verdana" w:cs="Calibri"/>
-                <w:color w:val="000000"/>
-                <w:sz w:val="16"/>
-                <w:szCs w:val="16"/>
-              </w:rPr>
-            </w:pPr>
-            <w:r>
-              <w:t>{status}{/</w:t>
-            </w:r>
-            <w:proofErr w:type="spellStart"/>
-            <w:r>
-              <w:t>otaLogs</w:t>
-            </w:r>
-            <w:proofErr w:type="spellEnd"/>
-            <w:r>
-              <w:t>}</w:t>
+              <w:jc w:val="center"/>
+              <w:rPr>
+                <w:rFonts w:ascii="Verdana" w:hAnsi="Verdana" w:cs="Calibri"/>
+                <w:color w:val="000000"/>
+                <w:sz w:val="18"/>
+                <w:szCs w:val="18"/>
+              </w:rPr>
+            </w:pPr>
+            <w:r>
+              <w:rPr>
+                <w:rFonts w:ascii="Verdana" w:hAnsi="Verdana" w:cs="Calibri"/>
+                <w:color w:val="000000"/>
+                <w:sz w:val="18"/>
+                <w:szCs w:val="18"/>
+              </w:rPr>
+              <w:t>{status}{/ota}</w:t>
             </w:r>
           </w:p>
         </w:tc>
@@ -9587,9 +9719,6 @@
       <w:pPr>
         <w:pStyle w:val="Heading1Numbered"/>
       </w:pPr>
-      <w:bookmarkStart w:id="55" w:name="_Toc66197316"/>
-      <w:bookmarkStart w:id="56" w:name="_Toc171507084"/>
-      <w:bookmarkStart w:id="57" w:name="_Toc62828420"/>
       <w:r>
         <w:lastRenderedPageBreak/>
         <w:t>SIM Card Pics</w:t>
@@ -10665,23 +10794,7 @@
           <w:rFonts w:ascii="Verdana" w:hAnsi="Verdana" w:cs="Calibri"/>
           <w:color w:val="000000"/>
         </w:rPr>
-        <w:t xml:space="preserve">File structure of these cards </w:t>
-      </w:r>
-      <w:proofErr w:type="gramStart"/>
-      <w:r>
-        <w:rPr>
-          <w:rFonts w:ascii="Verdana" w:hAnsi="Verdana" w:cs="Calibri"/>
-          <w:color w:val="000000"/>
-        </w:rPr>
-        <w:t>found</w:t>
-      </w:r>
-      <w:proofErr w:type="gramEnd"/>
-      <w:r>
-        <w:rPr>
-          <w:rFonts w:ascii="Verdana" w:hAnsi="Verdana" w:cs="Calibri"/>
-          <w:color w:val="000000"/>
-        </w:rPr>
-        <w:t xml:space="preserve"> ok.</w:t>
+        <w:t>File structure of these cards found ok.</w:t>
       </w:r>
     </w:p>
     <w:p>
@@ -10732,21 +10845,7 @@
         <w:rPr>
           <w:rFonts w:ascii="Verdana" w:hAnsi="Verdana"/>
         </w:rPr>
-        <w:t xml:space="preserve"> </w:t>
-      </w:r>
-      <w:proofErr w:type="gramStart"/>
-      <w:r>
-        <w:rPr>
-          <w:rFonts w:ascii="Verdana" w:hAnsi="Verdana"/>
-        </w:rPr>
-        <w:t>the class</w:t>
-      </w:r>
-      <w:proofErr w:type="gramEnd"/>
-      <w:r>
-        <w:rPr>
-          <w:rFonts w:ascii="Verdana" w:hAnsi="Verdana"/>
-        </w:rPr>
-        <w:t xml:space="preserve"> A power supply voltage.</w:t>
+        <w:t xml:space="preserve"> the class A power supply voltage.</w:t>
       </w:r>
     </w:p>
     <w:p>
@@ -10888,7 +10987,7 @@
                             <w:fldChar w:fldCharType="separate"/>
                           </w:r>
                           <w:r>
-                            <w:instrText>18</w:instrText>
+                            <w:instrText>15</w:instrText>
                           </w:r>
                           <w:r>
                             <w:fldChar w:fldCharType="end"/>
@@ -10942,7 +11041,7 @@
                             <w:fldChar w:fldCharType="separate"/>
                           </w:r>
                           <w:r>
-                            <w:instrText>18</w:instrText>
+                            <w:instrText>15</w:instrText>
                           </w:r>
                           <w:r>
                             <w:fldChar w:fldCharType="end"/>
@@ -11024,7 +11123,7 @@
                       <w:fldChar w:fldCharType="separate"/>
                     </w:r>
                     <w:r>
-                      <w:instrText>18</w:instrText>
+                      <w:instrText>15</w:instrText>
                     </w:r>
                     <w:r>
                       <w:fldChar w:fldCharType="end"/>
@@ -11078,7 +11177,7 @@
                       <w:fldChar w:fldCharType="separate"/>
                     </w:r>
                     <w:r>
-                      <w:instrText>18</w:instrText>
+                      <w:instrText>15</w:instrText>
                     </w:r>
                     <w:r>
                       <w:fldChar w:fldCharType="end"/>
@@ -11139,7 +11238,7 @@
       <w:fldChar w:fldCharType="separate"/>
     </w:r>
     <w:r>
-      <w:instrText>18</w:instrText>
+      <w:instrText>15</w:instrText>
     </w:r>
     <w:r>
       <w:fldChar w:fldCharType="end"/>
@@ -11177,7 +11276,7 @@
         <w:sz w:val="16"/>
         <w:szCs w:val="16"/>
       </w:rPr>
-      <w:instrText>18</w:instrText>
+      <w:instrText>15</w:instrText>
     </w:r>
     <w:r>
       <w:rPr>
@@ -11265,7 +11364,7 @@
         <w:sz w:val="16"/>
         <w:szCs w:val="16"/>
       </w:rPr>
-      <w:t>18</w:t>
+      <w:t>15</w:t>
     </w:r>
     <w:r>
       <w:rPr>
@@ -11462,7 +11561,7 @@
                             <w:fldChar w:fldCharType="separate"/>
                           </w:r>
                           <w:r>
-                            <w:instrText>18</w:instrText>
+                            <w:instrText>15</w:instrText>
                           </w:r>
                           <w:r>
                             <w:fldChar w:fldCharType="end"/>
@@ -11519,7 +11618,7 @@
                             <w:fldChar w:fldCharType="separate"/>
                           </w:r>
                           <w:r>
-                            <w:instrText>18</w:instrText>
+                            <w:instrText>15</w:instrText>
                           </w:r>
                           <w:r>
                             <w:fldChar w:fldCharType="end"/>
@@ -11602,7 +11701,7 @@
                       <w:fldChar w:fldCharType="separate"/>
                     </w:r>
                     <w:r>
-                      <w:instrText>18</w:instrText>
+                      <w:instrText>15</w:instrText>
                     </w:r>
                     <w:r>
                       <w:fldChar w:fldCharType="end"/>
@@ -11659,7 +11758,7 @@
                       <w:fldChar w:fldCharType="separate"/>
                     </w:r>
                     <w:r>
-                      <w:instrText>18</w:instrText>
+                      <w:instrText>15</w:instrText>
                     </w:r>
                     <w:r>
                       <w:fldChar w:fldCharType="end"/>
@@ -16423,6 +16522,79 @@
       <w:szCs w:val="20"/>
     </w:rPr>
   </w:style>
+  <w:style w:type="table" w:styleId="GridTable4-Accent5">
+    <w:name w:val="Grid Table 4 Accent 5"/>
+    <w:basedOn w:val="TableNormal"/>
+    <w:uiPriority w:val="49"/>
+    <w:rsid w:val="00F47D65"/>
+    <w:tblPr>
+      <w:tblStyleRowBandSize w:val="1"/>
+      <w:tblStyleColBandSize w:val="1"/>
+      <w:tblBorders>
+        <w:top w:val="single" w:sz="4" w:space="0" w:color="92CDDC" w:themeColor="accent5" w:themeTint="99"/>
+        <w:left w:val="single" w:sz="4" w:space="0" w:color="92CDDC" w:themeColor="accent5" w:themeTint="99"/>
+        <w:bottom w:val="single" w:sz="4" w:space="0" w:color="92CDDC" w:themeColor="accent5" w:themeTint="99"/>
+        <w:right w:val="single" w:sz="4" w:space="0" w:color="92CDDC" w:themeColor="accent5" w:themeTint="99"/>
+        <w:insideH w:val="single" w:sz="4" w:space="0" w:color="92CDDC" w:themeColor="accent5" w:themeTint="99"/>
+        <w:insideV w:val="single" w:sz="4" w:space="0" w:color="92CDDC" w:themeColor="accent5" w:themeTint="99"/>
+      </w:tblBorders>
+    </w:tblPr>
+    <w:tblStylePr w:type="firstRow">
+      <w:rPr>
+        <w:b/>
+        <w:bCs/>
+        <w:color w:val="FFFFFF" w:themeColor="background1"/>
+      </w:rPr>
+      <w:tblPr/>
+      <w:tcPr>
+        <w:tcBorders>
+          <w:top w:val="single" w:sz="4" w:space="0" w:color="4BACC6" w:themeColor="accent5"/>
+          <w:left w:val="single" w:sz="4" w:space="0" w:color="4BACC6" w:themeColor="accent5"/>
+          <w:bottom w:val="single" w:sz="4" w:space="0" w:color="4BACC6" w:themeColor="accent5"/>
+          <w:right w:val="single" w:sz="4" w:space="0" w:color="4BACC6" w:themeColor="accent5"/>
+          <w:insideH w:val="nil"/>
+          <w:insideV w:val="nil"/>
+        </w:tcBorders>
+        <w:shd w:val="clear" w:color="auto" w:fill="4BACC6" w:themeFill="accent5"/>
+      </w:tcPr>
+    </w:tblStylePr>
+    <w:tblStylePr w:type="lastRow">
+      <w:rPr>
+        <w:b/>
+        <w:bCs/>
+      </w:rPr>
+      <w:tblPr/>
+      <w:tcPr>
+        <w:tcBorders>
+          <w:top w:val="double" w:sz="4" w:space="0" w:color="4BACC6" w:themeColor="accent5"/>
+        </w:tcBorders>
+      </w:tcPr>
+    </w:tblStylePr>
+    <w:tblStylePr w:type="firstCol">
+      <w:rPr>
+        <w:b/>
+        <w:bCs/>
+      </w:rPr>
+    </w:tblStylePr>
+    <w:tblStylePr w:type="lastCol">
+      <w:rPr>
+        <w:b/>
+        <w:bCs/>
+      </w:rPr>
+    </w:tblStylePr>
+    <w:tblStylePr w:type="band1Vert">
+      <w:tblPr/>
+      <w:tcPr>
+        <w:shd w:val="clear" w:color="auto" w:fill="DAEEF3" w:themeFill="accent5" w:themeFillTint="33"/>
+      </w:tcPr>
+    </w:tblStylePr>
+    <w:tblStylePr w:type="band1Horz">
+      <w:tblPr/>
+      <w:tcPr>
+        <w:shd w:val="clear" w:color="auto" w:fill="DAEEF3" w:themeFill="accent5" w:themeFillTint="33"/>
+      </w:tcPr>
+    </w:tblStylePr>
+  </w:style>
 </w:styles>
 </file>
 

</xml_diff>